<commit_message>
- Updated model with the best hyperparameters so far for LFCC + Delta. - Results Report Spreadsheet
</commit_message>
<xml_diff>
--- a/results_report.docx
+++ b/results_report.docx
@@ -30,14 +30,21 @@
     </w:p>
     <w:p/>
     <w:p>
+      <w:proofErr w:type="spellStart"/>
       <w:r>
         <w:t>LogMEL</w:t>
       </w:r>
+      <w:proofErr w:type="spellEnd"/>
     </w:p>
     <w:p/>
     <w:p>
-      <w:r>
-        <w:t>LogMEL with Delta and Delta-Delta</w:t>
+      <w:proofErr w:type="spellStart"/>
+      <w:r>
+        <w:t>LogMEL</w:t>
+      </w:r>
+      <w:proofErr w:type="spellEnd"/>
+      <w:r>
+        <w:t xml:space="preserve"> with Delta and Delta-Delta</w:t>
       </w:r>
     </w:p>
     <w:p>
@@ -57,6 +64,9 @@
     </w:p>
     <w:p>
       <w:r>
+        <w:rPr>
+          <w:noProof/>
+        </w:rPr>
         <w:drawing>
           <wp:inline distT="0" distB="0" distL="0" distR="0" wp14:anchorId="22B66140" wp14:editId="0645DE6A">
             <wp:extent cx="3882572" cy="2854403"/>
@@ -96,6 +106,9 @@
     </w:p>
     <w:p>
       <w:r>
+        <w:rPr>
+          <w:noProof/>
+        </w:rPr>
         <w:drawing>
           <wp:inline distT="0" distB="0" distL="0" distR="0" wp14:anchorId="5784C66C" wp14:editId="42A14D78">
             <wp:extent cx="5400040" cy="2225675"/>
@@ -135,6 +148,9 @@
     </w:p>
     <w:p>
       <w:r>
+        <w:rPr>
+          <w:noProof/>
+        </w:rPr>
         <w:lastRenderedPageBreak/>
         <w:drawing>
           <wp:inline distT="0" distB="0" distL="0" distR="0" wp14:anchorId="1EDEA371" wp14:editId="7D01AEF3">
@@ -172,6 +188,9 @@
           </wp:inline>
         </w:drawing>
       </w:r>
+      <w:r>
+        <w:t>–</w:t>
+      </w:r>
     </w:p>
     <w:p>
       <w:r>
@@ -180,7 +199,17 @@
     </w:p>
     <w:p/>
     <w:p>
-      <w:r>
+      <w:pPr>
+        <w:rPr>
+          <w:b/>
+          <w:bCs/>
+        </w:rPr>
+      </w:pPr>
+      <w:r>
+        <w:rPr>
+          <w:b/>
+          <w:bCs/>
+        </w:rPr>
         <w:t>LFCC</w:t>
       </w:r>
     </w:p>
@@ -191,6 +220,9 @@
     </w:p>
     <w:p>
       <w:r>
+        <w:rPr>
+          <w:noProof/>
+        </w:rPr>
         <w:drawing>
           <wp:inline distT="0" distB="0" distL="0" distR="0" wp14:anchorId="41BE634A" wp14:editId="5D9BB022">
             <wp:extent cx="4329642" cy="3171371"/>
@@ -230,6 +262,9 @@
     </w:p>
     <w:p>
       <w:r>
+        <w:rPr>
+          <w:noProof/>
+        </w:rPr>
         <w:drawing>
           <wp:inline distT="0" distB="0" distL="0" distR="0" wp14:anchorId="37BE3FD1" wp14:editId="76D29C63">
             <wp:extent cx="5400040" cy="2225675"/>
@@ -269,6 +304,9 @@
     </w:p>
     <w:p>
       <w:r>
+        <w:rPr>
+          <w:noProof/>
+        </w:rPr>
         <w:lastRenderedPageBreak/>
         <w:drawing>
           <wp:inline distT="0" distB="0" distL="0" distR="0" wp14:anchorId="02D6786A" wp14:editId="247D5A4E">
@@ -310,21 +348,16 @@
     <w:p/>
     <w:p>
       <w:r>
-        <w:t>LFCC with Delta and Delta-Delta</w:t>
-      </w:r>
-    </w:p>
-    <w:p>
-      <w:r>
-        <w:t>10k samples:</w:t>
+        <w:t>Whole dataset (Learning rate: 1e-4 / Batch size: 32 / Patience: 10)</w:t>
       </w:r>
     </w:p>
     <w:p>
       <w:r>
         <w:drawing>
-          <wp:inline distT="0" distB="0" distL="0" distR="0" wp14:anchorId="26D48F3D" wp14:editId="4387CEC2">
-            <wp:extent cx="4120662" cy="3007637"/>
-            <wp:effectExtent l="0" t="0" r="0" b="2540"/>
-            <wp:docPr id="1262218729" name="Picture 1" descr="A screen shot of a computer&#10;&#10;AI-generated content may be incorrect."/>
+          <wp:inline distT="0" distB="0" distL="0" distR="0" wp14:anchorId="443BE169" wp14:editId="29297E61">
+            <wp:extent cx="5400040" cy="4071620"/>
+            <wp:effectExtent l="0" t="0" r="0" b="5080"/>
+            <wp:docPr id="1328198992" name="Picture 1" descr="A screenshot of a computer&#10;&#10;AI-generated content may be incorrect."/>
             <wp:cNvGraphicFramePr>
               <a:graphicFrameLocks xmlns:a="http://schemas.openxmlformats.org/drawingml/2006/main" noChangeAspect="1"/>
             </wp:cNvGraphicFramePr>
@@ -332,7 +365,7 @@
               <a:graphicData uri="http://schemas.openxmlformats.org/drawingml/2006/picture">
                 <pic:pic xmlns:pic="http://schemas.openxmlformats.org/drawingml/2006/picture">
                   <pic:nvPicPr>
-                    <pic:cNvPr id="1262218729" name="Picture 1" descr="A screen shot of a computer&#10;&#10;AI-generated content may be incorrect."/>
+                    <pic:cNvPr id="1328198992" name="Picture 1" descr="A screenshot of a computer&#10;&#10;AI-generated content may be incorrect."/>
                     <pic:cNvPicPr/>
                   </pic:nvPicPr>
                   <pic:blipFill>
@@ -344,7 +377,7 @@
                   <pic:spPr>
                     <a:xfrm>
                       <a:off x="0" y="0"/>
-                      <a:ext cx="4148166" cy="3027712"/>
+                      <a:ext cx="5400040" cy="4071620"/>
                     </a:xfrm>
                     <a:prstGeom prst="rect">
                       <a:avLst/>
@@ -360,10 +393,10 @@
     <w:p>
       <w:r>
         <w:drawing>
-          <wp:inline distT="0" distB="0" distL="0" distR="0" wp14:anchorId="4C13B9C6" wp14:editId="2BCABDD8">
+          <wp:inline distT="0" distB="0" distL="0" distR="0" wp14:anchorId="1FB981B6" wp14:editId="3AC547CD">
             <wp:extent cx="5400040" cy="2225675"/>
             <wp:effectExtent l="0" t="0" r="0" b="3175"/>
-            <wp:docPr id="2062457033" name="Picture 1" descr="A graph of loss and a loss&#10;&#10;AI-generated content may be incorrect."/>
+            <wp:docPr id="2124287550" name="Picture 1" descr="A graph of a line and a line&#10;&#10;AI-generated content may be incorrect."/>
             <wp:cNvGraphicFramePr>
               <a:graphicFrameLocks xmlns:a="http://schemas.openxmlformats.org/drawingml/2006/main" noChangeAspect="1"/>
             </wp:cNvGraphicFramePr>
@@ -371,7 +404,7 @@
               <a:graphicData uri="http://schemas.openxmlformats.org/drawingml/2006/picture">
                 <pic:pic xmlns:pic="http://schemas.openxmlformats.org/drawingml/2006/picture">
                   <pic:nvPicPr>
-                    <pic:cNvPr id="2062457033" name="Picture 1" descr="A graph of loss and a loss&#10;&#10;AI-generated content may be incorrect."/>
+                    <pic:cNvPr id="2124287550" name="Picture 1" descr="A graph of a line and a line&#10;&#10;AI-generated content may be incorrect."/>
                     <pic:cNvPicPr/>
                   </pic:nvPicPr>
                   <pic:blipFill>
@@ -398,6 +431,154 @@
     </w:p>
     <w:p>
       <w:r>
+        <w:lastRenderedPageBreak/>
+        <w:drawing>
+          <wp:inline distT="0" distB="0" distL="0" distR="0" wp14:anchorId="26E522A9" wp14:editId="044789DE">
+            <wp:extent cx="5400040" cy="1198880"/>
+            <wp:effectExtent l="0" t="0" r="0" b="1270"/>
+            <wp:docPr id="1314972586" name="Picture 1" descr="A screenshot of a computer&#10;&#10;AI-generated content may be incorrect."/>
+            <wp:cNvGraphicFramePr>
+              <a:graphicFrameLocks xmlns:a="http://schemas.openxmlformats.org/drawingml/2006/main" noChangeAspect="1"/>
+            </wp:cNvGraphicFramePr>
+            <a:graphic xmlns:a="http://schemas.openxmlformats.org/drawingml/2006/main">
+              <a:graphicData uri="http://schemas.openxmlformats.org/drawingml/2006/picture">
+                <pic:pic xmlns:pic="http://schemas.openxmlformats.org/drawingml/2006/picture">
+                  <pic:nvPicPr>
+                    <pic:cNvPr id="1314972586" name="Picture 1" descr="A screenshot of a computer&#10;&#10;AI-generated content may be incorrect."/>
+                    <pic:cNvPicPr/>
+                  </pic:nvPicPr>
+                  <pic:blipFill>
+                    <a:blip r:embed="rId12"/>
+                    <a:stretch>
+                      <a:fillRect/>
+                    </a:stretch>
+                  </pic:blipFill>
+                  <pic:spPr>
+                    <a:xfrm>
+                      <a:off x="0" y="0"/>
+                      <a:ext cx="5400040" cy="1198880"/>
+                    </a:xfrm>
+                    <a:prstGeom prst="rect">
+                      <a:avLst/>
+                    </a:prstGeom>
+                  </pic:spPr>
+                </pic:pic>
+              </a:graphicData>
+            </a:graphic>
+          </wp:inline>
+        </w:drawing>
+      </w:r>
+    </w:p>
+    <w:p/>
+    <w:p>
+      <w:pPr>
+        <w:rPr>
+          <w:b/>
+          <w:bCs/>
+        </w:rPr>
+      </w:pPr>
+      <w:r>
+        <w:rPr>
+          <w:b/>
+          <w:bCs/>
+        </w:rPr>
+        <w:t>LFCC with Delta and Delta-Delta</w:t>
+      </w:r>
+    </w:p>
+    <w:p>
+      <w:r>
+        <w:t>10k samples:</w:t>
+      </w:r>
+    </w:p>
+    <w:p>
+      <w:r>
+        <w:rPr>
+          <w:noProof/>
+        </w:rPr>
+        <w:drawing>
+          <wp:inline distT="0" distB="0" distL="0" distR="0" wp14:anchorId="26D48F3D" wp14:editId="4387CEC2">
+            <wp:extent cx="4120662" cy="3007637"/>
+            <wp:effectExtent l="0" t="0" r="0" b="2540"/>
+            <wp:docPr id="1262218729" name="Picture 1" descr="A screen shot of a computer&#10;&#10;AI-generated content may be incorrect."/>
+            <wp:cNvGraphicFramePr>
+              <a:graphicFrameLocks xmlns:a="http://schemas.openxmlformats.org/drawingml/2006/main" noChangeAspect="1"/>
+            </wp:cNvGraphicFramePr>
+            <a:graphic xmlns:a="http://schemas.openxmlformats.org/drawingml/2006/main">
+              <a:graphicData uri="http://schemas.openxmlformats.org/drawingml/2006/picture">
+                <pic:pic xmlns:pic="http://schemas.openxmlformats.org/drawingml/2006/picture">
+                  <pic:nvPicPr>
+                    <pic:cNvPr id="1262218729" name="Picture 1" descr="A screen shot of a computer&#10;&#10;AI-generated content may be incorrect."/>
+                    <pic:cNvPicPr/>
+                  </pic:nvPicPr>
+                  <pic:blipFill>
+                    <a:blip r:embed="rId13"/>
+                    <a:stretch>
+                      <a:fillRect/>
+                    </a:stretch>
+                  </pic:blipFill>
+                  <pic:spPr>
+                    <a:xfrm>
+                      <a:off x="0" y="0"/>
+                      <a:ext cx="4148166" cy="3027712"/>
+                    </a:xfrm>
+                    <a:prstGeom prst="rect">
+                      <a:avLst/>
+                    </a:prstGeom>
+                  </pic:spPr>
+                </pic:pic>
+              </a:graphicData>
+            </a:graphic>
+          </wp:inline>
+        </w:drawing>
+      </w:r>
+    </w:p>
+    <w:p>
+      <w:r>
+        <w:rPr>
+          <w:noProof/>
+        </w:rPr>
+        <w:drawing>
+          <wp:inline distT="0" distB="0" distL="0" distR="0" wp14:anchorId="4C13B9C6" wp14:editId="2BCABDD8">
+            <wp:extent cx="5400040" cy="2225675"/>
+            <wp:effectExtent l="0" t="0" r="0" b="3175"/>
+            <wp:docPr id="2062457033" name="Picture 1" descr="A graph of loss and a loss&#10;&#10;AI-generated content may be incorrect."/>
+            <wp:cNvGraphicFramePr>
+              <a:graphicFrameLocks xmlns:a="http://schemas.openxmlformats.org/drawingml/2006/main" noChangeAspect="1"/>
+            </wp:cNvGraphicFramePr>
+            <a:graphic xmlns:a="http://schemas.openxmlformats.org/drawingml/2006/main">
+              <a:graphicData uri="http://schemas.openxmlformats.org/drawingml/2006/picture">
+                <pic:pic xmlns:pic="http://schemas.openxmlformats.org/drawingml/2006/picture">
+                  <pic:nvPicPr>
+                    <pic:cNvPr id="2062457033" name="Picture 1" descr="A graph of loss and a loss&#10;&#10;AI-generated content may be incorrect."/>
+                    <pic:cNvPicPr/>
+                  </pic:nvPicPr>
+                  <pic:blipFill>
+                    <a:blip r:embed="rId14"/>
+                    <a:stretch>
+                      <a:fillRect/>
+                    </a:stretch>
+                  </pic:blipFill>
+                  <pic:spPr>
+                    <a:xfrm>
+                      <a:off x="0" y="0"/>
+                      <a:ext cx="5400040" cy="2225675"/>
+                    </a:xfrm>
+                    <a:prstGeom prst="rect">
+                      <a:avLst/>
+                    </a:prstGeom>
+                  </pic:spPr>
+                </pic:pic>
+              </a:graphicData>
+            </a:graphic>
+          </wp:inline>
+        </w:drawing>
+      </w:r>
+    </w:p>
+    <w:p>
+      <w:r>
+        <w:rPr>
+          <w:noProof/>
+        </w:rPr>
         <w:drawing>
           <wp:inline distT="0" distB="0" distL="0" distR="0" wp14:anchorId="1BE1C3F0" wp14:editId="3F269811">
             <wp:extent cx="5400040" cy="967105"/>
@@ -414,7 +595,7 @@
                     <pic:cNvPicPr/>
                   </pic:nvPicPr>
                   <pic:blipFill>
-                    <a:blip r:embed="rId12"/>
+                    <a:blip r:embed="rId15"/>
                     <a:stretch>
                       <a:fillRect/>
                     </a:stretch>
@@ -427,6 +608,157 @@
                     <a:prstGeom prst="rect">
                       <a:avLst/>
                     </a:prstGeom>
+                  </pic:spPr>
+                </pic:pic>
+              </a:graphicData>
+            </a:graphic>
+          </wp:inline>
+        </w:drawing>
+      </w:r>
+    </w:p>
+    <w:p/>
+    <w:p>
+      <w:r>
+        <w:t>Whole dataset:</w:t>
+      </w:r>
+    </w:p>
+    <w:p>
+      <w:r>
+        <w:rPr>
+          <w:noProof/>
+        </w:rPr>
+        <w:drawing>
+          <wp:inline distT="0" distB="0" distL="0" distR="0" wp14:anchorId="6D39D3D2" wp14:editId="6CB33CD0">
+            <wp:extent cx="5400040" cy="4013835"/>
+            <wp:effectExtent l="0" t="0" r="0" b="5715"/>
+            <wp:docPr id="2140586476" name="Picture 1" descr="A screenshot of a computer&#10;&#10;AI-generated content may be incorrect."/>
+            <wp:cNvGraphicFramePr>
+              <a:graphicFrameLocks xmlns:a="http://schemas.openxmlformats.org/drawingml/2006/main" noChangeAspect="1"/>
+            </wp:cNvGraphicFramePr>
+            <a:graphic xmlns:a="http://schemas.openxmlformats.org/drawingml/2006/main">
+              <a:graphicData uri="http://schemas.openxmlformats.org/drawingml/2006/picture">
+                <pic:pic xmlns:pic="http://schemas.openxmlformats.org/drawingml/2006/picture">
+                  <pic:nvPicPr>
+                    <pic:cNvPr id="2140586476" name="Picture 1" descr="A screenshot of a computer&#10;&#10;AI-generated content may be incorrect."/>
+                    <pic:cNvPicPr/>
+                  </pic:nvPicPr>
+                  <pic:blipFill>
+                    <a:blip r:embed="rId16"/>
+                    <a:stretch>
+                      <a:fillRect/>
+                    </a:stretch>
+                  </pic:blipFill>
+                  <pic:spPr>
+                    <a:xfrm>
+                      <a:off x="0" y="0"/>
+                      <a:ext cx="5400040" cy="4013835"/>
+                    </a:xfrm>
+                    <a:prstGeom prst="rect">
+                      <a:avLst/>
+                    </a:prstGeom>
+                  </pic:spPr>
+                </pic:pic>
+              </a:graphicData>
+            </a:graphic>
+          </wp:inline>
+        </w:drawing>
+      </w:r>
+    </w:p>
+    <w:p>
+      <w:r>
+        <w:rPr>
+          <w:noProof/>
+        </w:rPr>
+        <w:drawing>
+          <wp:inline distT="0" distB="0" distL="0" distR="0" wp14:anchorId="561B808C" wp14:editId="6B519454">
+            <wp:extent cx="5400040" cy="2225675"/>
+            <wp:effectExtent l="0" t="0" r="0" b="3175"/>
+            <wp:docPr id="1534854756" name="Picture 1" descr="A graph of a line and a line&#10;&#10;AI-generated content may be incorrect."/>
+            <wp:cNvGraphicFramePr>
+              <a:graphicFrameLocks xmlns:a="http://schemas.openxmlformats.org/drawingml/2006/main" noChangeAspect="1"/>
+            </wp:cNvGraphicFramePr>
+            <a:graphic xmlns:a="http://schemas.openxmlformats.org/drawingml/2006/main">
+              <a:graphicData uri="http://schemas.openxmlformats.org/drawingml/2006/picture">
+                <pic:pic xmlns:pic="http://schemas.openxmlformats.org/drawingml/2006/picture">
+                  <pic:nvPicPr>
+                    <pic:cNvPr id="1534854756" name="Picture 1" descr="A graph of a line and a line&#10;&#10;AI-generated content may be incorrect."/>
+                    <pic:cNvPicPr/>
+                  </pic:nvPicPr>
+                  <pic:blipFill>
+                    <a:blip r:embed="rId11"/>
+                    <a:stretch>
+                      <a:fillRect/>
+                    </a:stretch>
+                  </pic:blipFill>
+                  <pic:spPr>
+                    <a:xfrm>
+                      <a:off x="0" y="0"/>
+                      <a:ext cx="5400040" cy="2225675"/>
+                    </a:xfrm>
+                    <a:prstGeom prst="rect">
+                      <a:avLst/>
+                    </a:prstGeom>
+                  </pic:spPr>
+                </pic:pic>
+              </a:graphicData>
+            </a:graphic>
+          </wp:inline>
+        </w:drawing>
+      </w:r>
+    </w:p>
+    <w:p>
+      <w:r>
+        <w:t>Test set results:</w:t>
+      </w:r>
+      <w:r>
+        <w:br/>
+      </w:r>
+      <w:r>
+        <w:rPr>
+          <w:noProof/>
+        </w:rPr>
+        <w:drawing>
+          <wp:inline distT="0" distB="0" distL="0" distR="0" wp14:anchorId="58163E68" wp14:editId="01DFB513">
+            <wp:extent cx="5400040" cy="1207770"/>
+            <wp:effectExtent l="0" t="0" r="0" b="0"/>
+            <wp:docPr id="724879874" name="Picture 1" descr="A screenshot of a computer&#10;&#10;AI-generated content may be incorrect."/>
+            <wp:cNvGraphicFramePr>
+              <a:graphicFrameLocks xmlns:a="http://schemas.openxmlformats.org/drawingml/2006/main" noChangeAspect="1"/>
+            </wp:cNvGraphicFramePr>
+            <a:graphic xmlns:a="http://schemas.openxmlformats.org/drawingml/2006/main">
+              <a:graphicData uri="http://schemas.openxmlformats.org/drawingml/2006/picture">
+                <pic:pic xmlns:pic="http://schemas.openxmlformats.org/drawingml/2006/picture">
+                  <pic:nvPicPr>
+                    <pic:cNvPr id="724879874" name="Picture 1" descr="A screenshot of a computer&#10;&#10;AI-generated content may be incorrect."/>
+                    <pic:cNvPicPr>
+                      <a:picLocks noChangeAspect="1" noChangeArrowheads="1"/>
+                    </pic:cNvPicPr>
+                  </pic:nvPicPr>
+                  <pic:blipFill>
+                    <a:blip r:embed="rId17">
+                      <a:extLst>
+                        <a:ext uri="{28A0092B-C50C-407E-A947-70E740481C1C}">
+                          <a14:useLocalDpi xmlns:a14="http://schemas.microsoft.com/office/drawing/2010/main" val="0"/>
+                        </a:ext>
+                      </a:extLst>
+                    </a:blip>
+                    <a:srcRect/>
+                    <a:stretch>
+                      <a:fillRect/>
+                    </a:stretch>
+                  </pic:blipFill>
+                  <pic:spPr bwMode="auto">
+                    <a:xfrm>
+                      <a:off x="0" y="0"/>
+                      <a:ext cx="5400040" cy="1207770"/>
+                    </a:xfrm>
+                    <a:prstGeom prst="rect">
+                      <a:avLst/>
+                    </a:prstGeom>
+                    <a:noFill/>
+                    <a:ln>
+                      <a:noFill/>
+                    </a:ln>
                   </pic:spPr>
                 </pic:pic>
               </a:graphicData>
@@ -1065,6 +1397,7 @@
   <w:style w:type="character" w:default="1" w:styleId="DefaultParagraphFont">
     <w:name w:val="Default Paragraph Font"/>
     <w:uiPriority w:val="1"/>
+    <w:semiHidden/>
     <w:unhideWhenUsed/>
   </w:style>
   <w:style w:type="table" w:default="1" w:styleId="TableNormal">

</xml_diff>

<commit_message>
- Best LFCC + Delta model so far - Updated the spreadsheet with wav2vec results
</commit_message>
<xml_diff>
--- a/results_report.docx
+++ b/results_report.docx
@@ -9,6 +9,8 @@
           <w:bCs/>
         </w:rPr>
       </w:pPr>
+      <w:bookmarkStart w:id="0" w:name="_Hlk201613279"/>
+      <w:bookmarkEnd w:id="0"/>
       <w:r>
         <w:rPr>
           <w:b/>
@@ -18,48 +20,31 @@
       </w:r>
     </w:p>
     <w:p>
-      <w:r>
-        <w:t>STFT</w:t>
-      </w:r>
-    </w:p>
-    <w:p/>
-    <w:p>
-      <w:r>
-        <w:t>STFT with Delta and Delta-Delta</w:t>
-      </w:r>
-    </w:p>
-    <w:p/>
-    <w:p>
-      <w:proofErr w:type="spellStart"/>
-      <w:r>
-        <w:t>LogMEL</w:t>
-      </w:r>
-      <w:proofErr w:type="spellEnd"/>
-    </w:p>
-    <w:p/>
-    <w:p>
-      <w:proofErr w:type="spellStart"/>
-      <w:r>
-        <w:t>LogMEL</w:t>
-      </w:r>
-      <w:proofErr w:type="spellEnd"/>
-      <w:r>
-        <w:t xml:space="preserve"> with Delta and Delta-Delta</w:t>
-      </w:r>
-    </w:p>
-    <w:p>
-      <w:r>
-        <w:t>Epochs</w:t>
-      </w:r>
-    </w:p>
-    <w:p>
-      <w:r>
-        <w:t>MFCC</w:t>
-      </w:r>
-    </w:p>
-    <w:p>
-      <w:r>
-        <w:t>10k samples</w:t>
+      <w:pPr>
+        <w:rPr>
+          <w:b/>
+          <w:bCs/>
+        </w:rPr>
+      </w:pPr>
+    </w:p>
+    <w:p>
+      <w:pPr>
+        <w:rPr>
+          <w:b/>
+          <w:bCs/>
+        </w:rPr>
+      </w:pPr>
+      <w:r>
+        <w:rPr>
+          <w:b/>
+          <w:bCs/>
+        </w:rPr>
+        <w:t>LFCC with Delta and Delta-Delta</w:t>
+      </w:r>
+    </w:p>
+    <w:p>
+      <w:r>
+        <w:t>10k samples:</w:t>
       </w:r>
     </w:p>
     <w:p>
@@ -68,10 +53,18 @@
           <w:noProof/>
         </w:rPr>
         <w:drawing>
-          <wp:inline distT="0" distB="0" distL="0" distR="0" wp14:anchorId="22B66140" wp14:editId="0645DE6A">
-            <wp:extent cx="3882572" cy="2854403"/>
-            <wp:effectExtent l="0" t="0" r="3810" b="3175"/>
-            <wp:docPr id="1469750615" name="Picture 1" descr="A screenshot of a computer&#10;&#10;AI-generated content may be incorrect."/>
+          <wp:anchor distT="0" distB="0" distL="114300" distR="114300" simplePos="0" relativeHeight="251659264" behindDoc="0" locked="0" layoutInCell="1" allowOverlap="1" wp14:anchorId="6E7CCAAF" wp14:editId="31CC0953">
+            <wp:simplePos x="0" y="0"/>
+            <wp:positionH relativeFrom="column">
+              <wp:posOffset>4190191</wp:posOffset>
+            </wp:positionH>
+            <wp:positionV relativeFrom="paragraph">
+              <wp:posOffset>1979411</wp:posOffset>
+            </wp:positionV>
+            <wp:extent cx="5400040" cy="967105"/>
+            <wp:effectExtent l="0" t="0" r="0" b="4445"/>
+            <wp:wrapNone/>
+            <wp:docPr id="2019233037" name="Picture 1" descr="A screen shot of a computer&#10;&#10;AI-generated content may be incorrect."/>
             <wp:cNvGraphicFramePr>
               <a:graphicFrameLocks xmlns:a="http://schemas.openxmlformats.org/drawingml/2006/main" noChangeAspect="1"/>
             </wp:cNvGraphicFramePr>
@@ -79,11 +72,17 @@
               <a:graphicData uri="http://schemas.openxmlformats.org/drawingml/2006/picture">
                 <pic:pic xmlns:pic="http://schemas.openxmlformats.org/drawingml/2006/picture">
                   <pic:nvPicPr>
-                    <pic:cNvPr id="1469750615" name="Picture 1" descr="A screenshot of a computer&#10;&#10;AI-generated content may be incorrect."/>
+                    <pic:cNvPr id="2019233037" name="Picture 1" descr="A screen shot of a computer&#10;&#10;AI-generated content may be incorrect."/>
                     <pic:cNvPicPr/>
                   </pic:nvPicPr>
                   <pic:blipFill>
-                    <a:blip r:embed="rId4"/>
+                    <a:blip r:embed="rId4">
+                      <a:extLst>
+                        <a:ext uri="{28A0092B-C50C-407E-A947-70E740481C1C}">
+                          <a14:useLocalDpi xmlns:a14="http://schemas.microsoft.com/office/drawing/2010/main" val="0"/>
+                        </a:ext>
+                      </a:extLst>
+                    </a:blip>
                     <a:stretch>
                       <a:fillRect/>
                     </a:stretch>
@@ -91,7 +90,107 @@
                   <pic:spPr>
                     <a:xfrm>
                       <a:off x="0" y="0"/>
-                      <a:ext cx="3896387" cy="2864559"/>
+                      <a:ext cx="5400040" cy="967105"/>
+                    </a:xfrm>
+                    <a:prstGeom prst="rect">
+                      <a:avLst/>
+                    </a:prstGeom>
+                  </pic:spPr>
+                </pic:pic>
+              </a:graphicData>
+            </a:graphic>
+          </wp:anchor>
+        </w:drawing>
+      </w:r>
+      <w:r>
+        <w:rPr>
+          <w:noProof/>
+        </w:rPr>
+        <w:drawing>
+          <wp:anchor distT="0" distB="0" distL="114300" distR="114300" simplePos="0" relativeHeight="251658240" behindDoc="0" locked="0" layoutInCell="1" allowOverlap="1" wp14:anchorId="713EB8AE" wp14:editId="71D71B8D">
+            <wp:simplePos x="0" y="0"/>
+            <wp:positionH relativeFrom="margin">
+              <wp:posOffset>4163291</wp:posOffset>
+            </wp:positionH>
+            <wp:positionV relativeFrom="paragraph">
+              <wp:posOffset>3868</wp:posOffset>
+            </wp:positionV>
+            <wp:extent cx="4363720" cy="1798320"/>
+            <wp:effectExtent l="0" t="0" r="0" b="0"/>
+            <wp:wrapNone/>
+            <wp:docPr id="2062457033" name="Picture 1" descr="A graph of loss and a loss&#10;&#10;AI-generated content may be incorrect."/>
+            <wp:cNvGraphicFramePr>
+              <a:graphicFrameLocks xmlns:a="http://schemas.openxmlformats.org/drawingml/2006/main" noChangeAspect="1"/>
+            </wp:cNvGraphicFramePr>
+            <a:graphic xmlns:a="http://schemas.openxmlformats.org/drawingml/2006/main">
+              <a:graphicData uri="http://schemas.openxmlformats.org/drawingml/2006/picture">
+                <pic:pic xmlns:pic="http://schemas.openxmlformats.org/drawingml/2006/picture">
+                  <pic:nvPicPr>
+                    <pic:cNvPr id="2062457033" name="Picture 1" descr="A graph of loss and a loss&#10;&#10;AI-generated content may be incorrect."/>
+                    <pic:cNvPicPr/>
+                  </pic:nvPicPr>
+                  <pic:blipFill>
+                    <a:blip r:embed="rId5" cstate="print">
+                      <a:extLst>
+                        <a:ext uri="{28A0092B-C50C-407E-A947-70E740481C1C}">
+                          <a14:useLocalDpi xmlns:a14="http://schemas.microsoft.com/office/drawing/2010/main" val="0"/>
+                        </a:ext>
+                      </a:extLst>
+                    </a:blip>
+                    <a:stretch>
+                      <a:fillRect/>
+                    </a:stretch>
+                  </pic:blipFill>
+                  <pic:spPr>
+                    <a:xfrm>
+                      <a:off x="0" y="0"/>
+                      <a:ext cx="4363720" cy="1798320"/>
+                    </a:xfrm>
+                    <a:prstGeom prst="rect">
+                      <a:avLst/>
+                    </a:prstGeom>
+                  </pic:spPr>
+                </pic:pic>
+              </a:graphicData>
+            </a:graphic>
+          </wp:anchor>
+        </w:drawing>
+      </w:r>
+      <w:r>
+        <w:rPr>
+          <w:noProof/>
+        </w:rPr>
+        <w:t xml:space="preserve"> </w:t>
+      </w:r>
+      <w:r>
+        <w:rPr>
+          <w:noProof/>
+        </w:rPr>
+        <w:drawing>
+          <wp:inline distT="0" distB="0" distL="0" distR="0" wp14:anchorId="2FD95AFD" wp14:editId="2FCE5F4E">
+            <wp:extent cx="4038600" cy="2947742"/>
+            <wp:effectExtent l="0" t="0" r="0" b="5080"/>
+            <wp:docPr id="1262218729" name="Picture 1" descr="A screen shot of a computer&#10;&#10;AI-generated content may be incorrect."/>
+            <wp:cNvGraphicFramePr>
+              <a:graphicFrameLocks xmlns:a="http://schemas.openxmlformats.org/drawingml/2006/main" noChangeAspect="1"/>
+            </wp:cNvGraphicFramePr>
+            <a:graphic xmlns:a="http://schemas.openxmlformats.org/drawingml/2006/main">
+              <a:graphicData uri="http://schemas.openxmlformats.org/drawingml/2006/picture">
+                <pic:pic xmlns:pic="http://schemas.openxmlformats.org/drawingml/2006/picture">
+                  <pic:nvPicPr>
+                    <pic:cNvPr id="1262218729" name="Picture 1" descr="A screen shot of a computer&#10;&#10;AI-generated content may be incorrect."/>
+                    <pic:cNvPicPr/>
+                  </pic:nvPicPr>
+                  <pic:blipFill>
+                    <a:blip r:embed="rId6"/>
+                    <a:stretch>
+                      <a:fillRect/>
+                    </a:stretch>
+                  </pic:blipFill>
+                  <pic:spPr>
+                    <a:xfrm>
+                      <a:off x="0" y="0"/>
+                      <a:ext cx="4093951" cy="2988142"/>
                     </a:xfrm>
                     <a:prstGeom prst="rect">
                       <a:avLst/>
@@ -104,16 +203,38 @@
         </w:drawing>
       </w:r>
     </w:p>
-    <w:p>
+    <w:p/>
+    <w:p/>
+    <w:p/>
+    <w:p/>
+    <w:p/>
+    <w:p/>
+    <w:p/>
+    <w:p>
+      <w:pPr>
+        <w:rPr>
+          <w:b/>
+          <w:bCs/>
+        </w:rPr>
+      </w:pPr>
       <w:r>
         <w:rPr>
           <w:noProof/>
         </w:rPr>
+        <w:lastRenderedPageBreak/>
         <w:drawing>
-          <wp:inline distT="0" distB="0" distL="0" distR="0" wp14:anchorId="5784C66C" wp14:editId="42A14D78">
+          <wp:anchor distT="0" distB="0" distL="114300" distR="114300" simplePos="0" relativeHeight="251660288" behindDoc="0" locked="0" layoutInCell="1" allowOverlap="1" wp14:anchorId="67B21E11" wp14:editId="7FD57DD6">
+            <wp:simplePos x="0" y="0"/>
+            <wp:positionH relativeFrom="margin">
+              <wp:posOffset>4377690</wp:posOffset>
+            </wp:positionH>
+            <wp:positionV relativeFrom="paragraph">
+              <wp:posOffset>5830</wp:posOffset>
+            </wp:positionV>
             <wp:extent cx="5400040" cy="2225675"/>
             <wp:effectExtent l="0" t="0" r="0" b="3175"/>
-            <wp:docPr id="841847213" name="Picture 1" descr="A graph of a graph of two people&#10;&#10;AI-generated content may be incorrect."/>
+            <wp:wrapNone/>
+            <wp:docPr id="1534854756" name="Picture 1" descr="A graph of a line and a line&#10;&#10;AI-generated content may be incorrect."/>
             <wp:cNvGraphicFramePr>
               <a:graphicFrameLocks xmlns:a="http://schemas.openxmlformats.org/drawingml/2006/main" noChangeAspect="1"/>
             </wp:cNvGraphicFramePr>
@@ -121,11 +242,17 @@
               <a:graphicData uri="http://schemas.openxmlformats.org/drawingml/2006/picture">
                 <pic:pic xmlns:pic="http://schemas.openxmlformats.org/drawingml/2006/picture">
                   <pic:nvPicPr>
-                    <pic:cNvPr id="841847213" name="Picture 1" descr="A graph of a graph of two people&#10;&#10;AI-generated content may be incorrect."/>
+                    <pic:cNvPr id="1534854756" name="Picture 1" descr="A graph of a line and a line&#10;&#10;AI-generated content may be incorrect."/>
                     <pic:cNvPicPr/>
                   </pic:nvPicPr>
                   <pic:blipFill>
-                    <a:blip r:embed="rId5"/>
+                    <a:blip r:embed="rId7">
+                      <a:extLst>
+                        <a:ext uri="{28A0092B-C50C-407E-A947-70E740481C1C}">
+                          <a14:useLocalDpi xmlns:a14="http://schemas.microsoft.com/office/drawing/2010/main" val="0"/>
+                        </a:ext>
+                      </a:extLst>
+                    </a:blip>
                     <a:stretch>
                       <a:fillRect/>
                     </a:stretch>
@@ -142,80 +269,26 @@
                 </pic:pic>
               </a:graphicData>
             </a:graphic>
-          </wp:inline>
+          </wp:anchor>
         </w:drawing>
       </w:r>
-    </w:p>
-    <w:p>
-      <w:r>
-        <w:rPr>
-          <w:noProof/>
-        </w:rPr>
-        <w:lastRenderedPageBreak/>
-        <w:drawing>
-          <wp:inline distT="0" distB="0" distL="0" distR="0" wp14:anchorId="1EDEA371" wp14:editId="7D01AEF3">
-            <wp:extent cx="5400040" cy="956310"/>
-            <wp:effectExtent l="0" t="0" r="0" b="0"/>
-            <wp:docPr id="1341847390" name="Picture 1" descr="A screen shot of a computer&#10;&#10;AI-generated content may be incorrect."/>
-            <wp:cNvGraphicFramePr>
-              <a:graphicFrameLocks xmlns:a="http://schemas.openxmlformats.org/drawingml/2006/main" noChangeAspect="1"/>
-            </wp:cNvGraphicFramePr>
-            <a:graphic xmlns:a="http://schemas.openxmlformats.org/drawingml/2006/main">
-              <a:graphicData uri="http://schemas.openxmlformats.org/drawingml/2006/picture">
-                <pic:pic xmlns:pic="http://schemas.openxmlformats.org/drawingml/2006/picture">
-                  <pic:nvPicPr>
-                    <pic:cNvPr id="1341847390" name="Picture 1" descr="A screen shot of a computer&#10;&#10;AI-generated content may be incorrect."/>
-                    <pic:cNvPicPr/>
-                  </pic:nvPicPr>
-                  <pic:blipFill>
-                    <a:blip r:embed="rId6"/>
-                    <a:stretch>
-                      <a:fillRect/>
-                    </a:stretch>
-                  </pic:blipFill>
-                  <pic:spPr>
-                    <a:xfrm>
-                      <a:off x="0" y="0"/>
-                      <a:ext cx="5400040" cy="956310"/>
-                    </a:xfrm>
-                    <a:prstGeom prst="rect">
-                      <a:avLst/>
-                    </a:prstGeom>
-                  </pic:spPr>
-                </pic:pic>
-              </a:graphicData>
-            </a:graphic>
-          </wp:inline>
-        </w:drawing>
-      </w:r>
-      <w:r>
-        <w:t>–</w:t>
-      </w:r>
-    </w:p>
-    <w:p>
-      <w:r>
-        <w:t>MFCC with Delta and Delta-Delta</w:t>
-      </w:r>
-    </w:p>
-    <w:p/>
-    <w:p>
-      <w:pPr>
+      <w:r>
         <w:rPr>
           <w:b/>
           <w:bCs/>
         </w:rPr>
-      </w:pPr>
-      <w:r>
-        <w:rPr>
-          <w:b/>
-          <w:bCs/>
-        </w:rPr>
-        <w:t>LFCC</w:t>
-      </w:r>
-    </w:p>
-    <w:p>
-      <w:r>
-        <w:t>10k samples:</w:t>
+        <w:t>LFCC with Delta and Delta-Delta</w:t>
+      </w:r>
+    </w:p>
+    <w:p>
+      <w:r>
+        <w:t>Whole dataset</w:t>
+      </w:r>
+      <w:r>
+        <w:t xml:space="preserve"> (v1)</w:t>
+      </w:r>
+      <w:r>
+        <w:t>:</w:t>
       </w:r>
     </w:p>
     <w:p>
@@ -224,503 +297,17 @@
           <w:noProof/>
         </w:rPr>
         <w:drawing>
-          <wp:inline distT="0" distB="0" distL="0" distR="0" wp14:anchorId="41BE634A" wp14:editId="5D9BB022">
-            <wp:extent cx="4329642" cy="3171371"/>
-            <wp:effectExtent l="0" t="0" r="0" b="0"/>
-            <wp:docPr id="1622165654" name="Picture 1" descr="A screen shot of a computer&#10;&#10;AI-generated content may be incorrect."/>
-            <wp:cNvGraphicFramePr>
-              <a:graphicFrameLocks xmlns:a="http://schemas.openxmlformats.org/drawingml/2006/main" noChangeAspect="1"/>
-            </wp:cNvGraphicFramePr>
-            <a:graphic xmlns:a="http://schemas.openxmlformats.org/drawingml/2006/main">
-              <a:graphicData uri="http://schemas.openxmlformats.org/drawingml/2006/picture">
-                <pic:pic xmlns:pic="http://schemas.openxmlformats.org/drawingml/2006/picture">
-                  <pic:nvPicPr>
-                    <pic:cNvPr id="1622165654" name="Picture 1" descr="A screen shot of a computer&#10;&#10;AI-generated content may be incorrect."/>
-                    <pic:cNvPicPr/>
-                  </pic:nvPicPr>
-                  <pic:blipFill>
-                    <a:blip r:embed="rId7"/>
-                    <a:stretch>
-                      <a:fillRect/>
-                    </a:stretch>
-                  </pic:blipFill>
-                  <pic:spPr>
-                    <a:xfrm>
-                      <a:off x="0" y="0"/>
-                      <a:ext cx="4340825" cy="3179562"/>
-                    </a:xfrm>
-                    <a:prstGeom prst="rect">
-                      <a:avLst/>
-                    </a:prstGeom>
-                  </pic:spPr>
-                </pic:pic>
-              </a:graphicData>
-            </a:graphic>
-          </wp:inline>
-        </w:drawing>
-      </w:r>
-    </w:p>
-    <w:p>
-      <w:r>
-        <w:rPr>
-          <w:noProof/>
-        </w:rPr>
-        <w:drawing>
-          <wp:inline distT="0" distB="0" distL="0" distR="0" wp14:anchorId="37BE3FD1" wp14:editId="76D29C63">
-            <wp:extent cx="5400040" cy="2225675"/>
-            <wp:effectExtent l="0" t="0" r="0" b="3175"/>
-            <wp:docPr id="2034097849" name="Picture 1" descr="A graph of a graph of a graph of a graph of a graph of a graph of a graph of a graph of a graph of a graph of a graph of a graph of a graph of&#10;&#10;AI-generated content may be incorrect."/>
-            <wp:cNvGraphicFramePr>
-              <a:graphicFrameLocks xmlns:a="http://schemas.openxmlformats.org/drawingml/2006/main" noChangeAspect="1"/>
-            </wp:cNvGraphicFramePr>
-            <a:graphic xmlns:a="http://schemas.openxmlformats.org/drawingml/2006/main">
-              <a:graphicData uri="http://schemas.openxmlformats.org/drawingml/2006/picture">
-                <pic:pic xmlns:pic="http://schemas.openxmlformats.org/drawingml/2006/picture">
-                  <pic:nvPicPr>
-                    <pic:cNvPr id="2034097849" name="Picture 1" descr="A graph of a graph of a graph of a graph of a graph of a graph of a graph of a graph of a graph of a graph of a graph of a graph of a graph of&#10;&#10;AI-generated content may be incorrect."/>
-                    <pic:cNvPicPr/>
-                  </pic:nvPicPr>
-                  <pic:blipFill>
-                    <a:blip r:embed="rId8"/>
-                    <a:stretch>
-                      <a:fillRect/>
-                    </a:stretch>
-                  </pic:blipFill>
-                  <pic:spPr>
-                    <a:xfrm>
-                      <a:off x="0" y="0"/>
-                      <a:ext cx="5400040" cy="2225675"/>
-                    </a:xfrm>
-                    <a:prstGeom prst="rect">
-                      <a:avLst/>
-                    </a:prstGeom>
-                  </pic:spPr>
-                </pic:pic>
-              </a:graphicData>
-            </a:graphic>
-          </wp:inline>
-        </w:drawing>
-      </w:r>
-    </w:p>
-    <w:p>
-      <w:r>
-        <w:rPr>
-          <w:noProof/>
-        </w:rPr>
-        <w:lastRenderedPageBreak/>
-        <w:drawing>
-          <wp:inline distT="0" distB="0" distL="0" distR="0" wp14:anchorId="02D6786A" wp14:editId="247D5A4E">
-            <wp:extent cx="5400040" cy="989330"/>
-            <wp:effectExtent l="0" t="0" r="0" b="1270"/>
-            <wp:docPr id="1840558227" name="Picture 1" descr="A black screen with white text&#10;&#10;AI-generated content may be incorrect."/>
-            <wp:cNvGraphicFramePr>
-              <a:graphicFrameLocks xmlns:a="http://schemas.openxmlformats.org/drawingml/2006/main" noChangeAspect="1"/>
-            </wp:cNvGraphicFramePr>
-            <a:graphic xmlns:a="http://schemas.openxmlformats.org/drawingml/2006/main">
-              <a:graphicData uri="http://schemas.openxmlformats.org/drawingml/2006/picture">
-                <pic:pic xmlns:pic="http://schemas.openxmlformats.org/drawingml/2006/picture">
-                  <pic:nvPicPr>
-                    <pic:cNvPr id="1840558227" name="Picture 1" descr="A black screen with white text&#10;&#10;AI-generated content may be incorrect."/>
-                    <pic:cNvPicPr/>
-                  </pic:nvPicPr>
-                  <pic:blipFill>
-                    <a:blip r:embed="rId9"/>
-                    <a:stretch>
-                      <a:fillRect/>
-                    </a:stretch>
-                  </pic:blipFill>
-                  <pic:spPr>
-                    <a:xfrm>
-                      <a:off x="0" y="0"/>
-                      <a:ext cx="5400040" cy="989330"/>
-                    </a:xfrm>
-                    <a:prstGeom prst="rect">
-                      <a:avLst/>
-                    </a:prstGeom>
-                  </pic:spPr>
-                </pic:pic>
-              </a:graphicData>
-            </a:graphic>
-          </wp:inline>
-        </w:drawing>
-      </w:r>
-    </w:p>
-    <w:p/>
-    <w:p>
-      <w:r>
-        <w:t>Whole dataset (Learning rate: 1e-4 / Batch size: 32 / Patience: 10)</w:t>
-      </w:r>
-    </w:p>
-    <w:p>
-      <w:r>
-        <w:drawing>
-          <wp:inline distT="0" distB="0" distL="0" distR="0" wp14:anchorId="443BE169" wp14:editId="29297E61">
-            <wp:extent cx="5400040" cy="4071620"/>
-            <wp:effectExtent l="0" t="0" r="0" b="5080"/>
-            <wp:docPr id="1328198992" name="Picture 1" descr="A screenshot of a computer&#10;&#10;AI-generated content may be incorrect."/>
-            <wp:cNvGraphicFramePr>
-              <a:graphicFrameLocks xmlns:a="http://schemas.openxmlformats.org/drawingml/2006/main" noChangeAspect="1"/>
-            </wp:cNvGraphicFramePr>
-            <a:graphic xmlns:a="http://schemas.openxmlformats.org/drawingml/2006/main">
-              <a:graphicData uri="http://schemas.openxmlformats.org/drawingml/2006/picture">
-                <pic:pic xmlns:pic="http://schemas.openxmlformats.org/drawingml/2006/picture">
-                  <pic:nvPicPr>
-                    <pic:cNvPr id="1328198992" name="Picture 1" descr="A screenshot of a computer&#10;&#10;AI-generated content may be incorrect."/>
-                    <pic:cNvPicPr/>
-                  </pic:nvPicPr>
-                  <pic:blipFill>
-                    <a:blip r:embed="rId10"/>
-                    <a:stretch>
-                      <a:fillRect/>
-                    </a:stretch>
-                  </pic:blipFill>
-                  <pic:spPr>
-                    <a:xfrm>
-                      <a:off x="0" y="0"/>
-                      <a:ext cx="5400040" cy="4071620"/>
-                    </a:xfrm>
-                    <a:prstGeom prst="rect">
-                      <a:avLst/>
-                    </a:prstGeom>
-                  </pic:spPr>
-                </pic:pic>
-              </a:graphicData>
-            </a:graphic>
-          </wp:inline>
-        </w:drawing>
-      </w:r>
-    </w:p>
-    <w:p>
-      <w:r>
-        <w:drawing>
-          <wp:inline distT="0" distB="0" distL="0" distR="0" wp14:anchorId="1FB981B6" wp14:editId="3AC547CD">
-            <wp:extent cx="5400040" cy="2225675"/>
-            <wp:effectExtent l="0" t="0" r="0" b="3175"/>
-            <wp:docPr id="2124287550" name="Picture 1" descr="A graph of a line and a line&#10;&#10;AI-generated content may be incorrect."/>
-            <wp:cNvGraphicFramePr>
-              <a:graphicFrameLocks xmlns:a="http://schemas.openxmlformats.org/drawingml/2006/main" noChangeAspect="1"/>
-            </wp:cNvGraphicFramePr>
-            <a:graphic xmlns:a="http://schemas.openxmlformats.org/drawingml/2006/main">
-              <a:graphicData uri="http://schemas.openxmlformats.org/drawingml/2006/picture">
-                <pic:pic xmlns:pic="http://schemas.openxmlformats.org/drawingml/2006/picture">
-                  <pic:nvPicPr>
-                    <pic:cNvPr id="2124287550" name="Picture 1" descr="A graph of a line and a line&#10;&#10;AI-generated content may be incorrect."/>
-                    <pic:cNvPicPr/>
-                  </pic:nvPicPr>
-                  <pic:blipFill>
-                    <a:blip r:embed="rId11"/>
-                    <a:stretch>
-                      <a:fillRect/>
-                    </a:stretch>
-                  </pic:blipFill>
-                  <pic:spPr>
-                    <a:xfrm>
-                      <a:off x="0" y="0"/>
-                      <a:ext cx="5400040" cy="2225675"/>
-                    </a:xfrm>
-                    <a:prstGeom prst="rect">
-                      <a:avLst/>
-                    </a:prstGeom>
-                  </pic:spPr>
-                </pic:pic>
-              </a:graphicData>
-            </a:graphic>
-          </wp:inline>
-        </w:drawing>
-      </w:r>
-    </w:p>
-    <w:p>
-      <w:r>
-        <w:lastRenderedPageBreak/>
-        <w:drawing>
-          <wp:inline distT="0" distB="0" distL="0" distR="0" wp14:anchorId="26E522A9" wp14:editId="044789DE">
-            <wp:extent cx="5400040" cy="1198880"/>
-            <wp:effectExtent l="0" t="0" r="0" b="1270"/>
-            <wp:docPr id="1314972586" name="Picture 1" descr="A screenshot of a computer&#10;&#10;AI-generated content may be incorrect."/>
-            <wp:cNvGraphicFramePr>
-              <a:graphicFrameLocks xmlns:a="http://schemas.openxmlformats.org/drawingml/2006/main" noChangeAspect="1"/>
-            </wp:cNvGraphicFramePr>
-            <a:graphic xmlns:a="http://schemas.openxmlformats.org/drawingml/2006/main">
-              <a:graphicData uri="http://schemas.openxmlformats.org/drawingml/2006/picture">
-                <pic:pic xmlns:pic="http://schemas.openxmlformats.org/drawingml/2006/picture">
-                  <pic:nvPicPr>
-                    <pic:cNvPr id="1314972586" name="Picture 1" descr="A screenshot of a computer&#10;&#10;AI-generated content may be incorrect."/>
-                    <pic:cNvPicPr/>
-                  </pic:nvPicPr>
-                  <pic:blipFill>
-                    <a:blip r:embed="rId12"/>
-                    <a:stretch>
-                      <a:fillRect/>
-                    </a:stretch>
-                  </pic:blipFill>
-                  <pic:spPr>
-                    <a:xfrm>
-                      <a:off x="0" y="0"/>
-                      <a:ext cx="5400040" cy="1198880"/>
-                    </a:xfrm>
-                    <a:prstGeom prst="rect">
-                      <a:avLst/>
-                    </a:prstGeom>
-                  </pic:spPr>
-                </pic:pic>
-              </a:graphicData>
-            </a:graphic>
-          </wp:inline>
-        </w:drawing>
-      </w:r>
-    </w:p>
-    <w:p/>
-    <w:p>
-      <w:pPr>
-        <w:rPr>
-          <w:b/>
-          <w:bCs/>
-        </w:rPr>
-      </w:pPr>
-      <w:r>
-        <w:rPr>
-          <w:b/>
-          <w:bCs/>
-        </w:rPr>
-        <w:t>LFCC with Delta and Delta-Delta</w:t>
-      </w:r>
-    </w:p>
-    <w:p>
-      <w:r>
-        <w:t>10k samples:</w:t>
-      </w:r>
-    </w:p>
-    <w:p>
-      <w:r>
-        <w:rPr>
-          <w:noProof/>
-        </w:rPr>
-        <w:drawing>
-          <wp:inline distT="0" distB="0" distL="0" distR="0" wp14:anchorId="26D48F3D" wp14:editId="4387CEC2">
-            <wp:extent cx="4120662" cy="3007637"/>
-            <wp:effectExtent l="0" t="0" r="0" b="2540"/>
-            <wp:docPr id="1262218729" name="Picture 1" descr="A screen shot of a computer&#10;&#10;AI-generated content may be incorrect."/>
-            <wp:cNvGraphicFramePr>
-              <a:graphicFrameLocks xmlns:a="http://schemas.openxmlformats.org/drawingml/2006/main" noChangeAspect="1"/>
-            </wp:cNvGraphicFramePr>
-            <a:graphic xmlns:a="http://schemas.openxmlformats.org/drawingml/2006/main">
-              <a:graphicData uri="http://schemas.openxmlformats.org/drawingml/2006/picture">
-                <pic:pic xmlns:pic="http://schemas.openxmlformats.org/drawingml/2006/picture">
-                  <pic:nvPicPr>
-                    <pic:cNvPr id="1262218729" name="Picture 1" descr="A screen shot of a computer&#10;&#10;AI-generated content may be incorrect."/>
-                    <pic:cNvPicPr/>
-                  </pic:nvPicPr>
-                  <pic:blipFill>
-                    <a:blip r:embed="rId13"/>
-                    <a:stretch>
-                      <a:fillRect/>
-                    </a:stretch>
-                  </pic:blipFill>
-                  <pic:spPr>
-                    <a:xfrm>
-                      <a:off x="0" y="0"/>
-                      <a:ext cx="4148166" cy="3027712"/>
-                    </a:xfrm>
-                    <a:prstGeom prst="rect">
-                      <a:avLst/>
-                    </a:prstGeom>
-                  </pic:spPr>
-                </pic:pic>
-              </a:graphicData>
-            </a:graphic>
-          </wp:inline>
-        </w:drawing>
-      </w:r>
-    </w:p>
-    <w:p>
-      <w:r>
-        <w:rPr>
-          <w:noProof/>
-        </w:rPr>
-        <w:drawing>
-          <wp:inline distT="0" distB="0" distL="0" distR="0" wp14:anchorId="4C13B9C6" wp14:editId="2BCABDD8">
-            <wp:extent cx="5400040" cy="2225675"/>
-            <wp:effectExtent l="0" t="0" r="0" b="3175"/>
-            <wp:docPr id="2062457033" name="Picture 1" descr="A graph of loss and a loss&#10;&#10;AI-generated content may be incorrect."/>
-            <wp:cNvGraphicFramePr>
-              <a:graphicFrameLocks xmlns:a="http://schemas.openxmlformats.org/drawingml/2006/main" noChangeAspect="1"/>
-            </wp:cNvGraphicFramePr>
-            <a:graphic xmlns:a="http://schemas.openxmlformats.org/drawingml/2006/main">
-              <a:graphicData uri="http://schemas.openxmlformats.org/drawingml/2006/picture">
-                <pic:pic xmlns:pic="http://schemas.openxmlformats.org/drawingml/2006/picture">
-                  <pic:nvPicPr>
-                    <pic:cNvPr id="2062457033" name="Picture 1" descr="A graph of loss and a loss&#10;&#10;AI-generated content may be incorrect."/>
-                    <pic:cNvPicPr/>
-                  </pic:nvPicPr>
-                  <pic:blipFill>
-                    <a:blip r:embed="rId14"/>
-                    <a:stretch>
-                      <a:fillRect/>
-                    </a:stretch>
-                  </pic:blipFill>
-                  <pic:spPr>
-                    <a:xfrm>
-                      <a:off x="0" y="0"/>
-                      <a:ext cx="5400040" cy="2225675"/>
-                    </a:xfrm>
-                    <a:prstGeom prst="rect">
-                      <a:avLst/>
-                    </a:prstGeom>
-                  </pic:spPr>
-                </pic:pic>
-              </a:graphicData>
-            </a:graphic>
-          </wp:inline>
-        </w:drawing>
-      </w:r>
-    </w:p>
-    <w:p>
-      <w:r>
-        <w:rPr>
-          <w:noProof/>
-        </w:rPr>
-        <w:drawing>
-          <wp:inline distT="0" distB="0" distL="0" distR="0" wp14:anchorId="1BE1C3F0" wp14:editId="3F269811">
-            <wp:extent cx="5400040" cy="967105"/>
-            <wp:effectExtent l="0" t="0" r="0" b="4445"/>
-            <wp:docPr id="2019233037" name="Picture 1" descr="A screen shot of a computer&#10;&#10;AI-generated content may be incorrect."/>
-            <wp:cNvGraphicFramePr>
-              <a:graphicFrameLocks xmlns:a="http://schemas.openxmlformats.org/drawingml/2006/main" noChangeAspect="1"/>
-            </wp:cNvGraphicFramePr>
-            <a:graphic xmlns:a="http://schemas.openxmlformats.org/drawingml/2006/main">
-              <a:graphicData uri="http://schemas.openxmlformats.org/drawingml/2006/picture">
-                <pic:pic xmlns:pic="http://schemas.openxmlformats.org/drawingml/2006/picture">
-                  <pic:nvPicPr>
-                    <pic:cNvPr id="2019233037" name="Picture 1" descr="A screen shot of a computer&#10;&#10;AI-generated content may be incorrect."/>
-                    <pic:cNvPicPr/>
-                  </pic:nvPicPr>
-                  <pic:blipFill>
-                    <a:blip r:embed="rId15"/>
-                    <a:stretch>
-                      <a:fillRect/>
-                    </a:stretch>
-                  </pic:blipFill>
-                  <pic:spPr>
-                    <a:xfrm>
-                      <a:off x="0" y="0"/>
-                      <a:ext cx="5400040" cy="967105"/>
-                    </a:xfrm>
-                    <a:prstGeom prst="rect">
-                      <a:avLst/>
-                    </a:prstGeom>
-                  </pic:spPr>
-                </pic:pic>
-              </a:graphicData>
-            </a:graphic>
-          </wp:inline>
-        </w:drawing>
-      </w:r>
-    </w:p>
-    <w:p/>
-    <w:p>
-      <w:r>
-        <w:t>Whole dataset:</w:t>
-      </w:r>
-    </w:p>
-    <w:p>
-      <w:r>
-        <w:rPr>
-          <w:noProof/>
-        </w:rPr>
-        <w:drawing>
-          <wp:inline distT="0" distB="0" distL="0" distR="0" wp14:anchorId="6D39D3D2" wp14:editId="6CB33CD0">
-            <wp:extent cx="5400040" cy="4013835"/>
-            <wp:effectExtent l="0" t="0" r="0" b="5715"/>
-            <wp:docPr id="2140586476" name="Picture 1" descr="A screenshot of a computer&#10;&#10;AI-generated content may be incorrect."/>
-            <wp:cNvGraphicFramePr>
-              <a:graphicFrameLocks xmlns:a="http://schemas.openxmlformats.org/drawingml/2006/main" noChangeAspect="1"/>
-            </wp:cNvGraphicFramePr>
-            <a:graphic xmlns:a="http://schemas.openxmlformats.org/drawingml/2006/main">
-              <a:graphicData uri="http://schemas.openxmlformats.org/drawingml/2006/picture">
-                <pic:pic xmlns:pic="http://schemas.openxmlformats.org/drawingml/2006/picture">
-                  <pic:nvPicPr>
-                    <pic:cNvPr id="2140586476" name="Picture 1" descr="A screenshot of a computer&#10;&#10;AI-generated content may be incorrect."/>
-                    <pic:cNvPicPr/>
-                  </pic:nvPicPr>
-                  <pic:blipFill>
-                    <a:blip r:embed="rId16"/>
-                    <a:stretch>
-                      <a:fillRect/>
-                    </a:stretch>
-                  </pic:blipFill>
-                  <pic:spPr>
-                    <a:xfrm>
-                      <a:off x="0" y="0"/>
-                      <a:ext cx="5400040" cy="4013835"/>
-                    </a:xfrm>
-                    <a:prstGeom prst="rect">
-                      <a:avLst/>
-                    </a:prstGeom>
-                  </pic:spPr>
-                </pic:pic>
-              </a:graphicData>
-            </a:graphic>
-          </wp:inline>
-        </w:drawing>
-      </w:r>
-    </w:p>
-    <w:p>
-      <w:r>
-        <w:rPr>
-          <w:noProof/>
-        </w:rPr>
-        <w:drawing>
-          <wp:inline distT="0" distB="0" distL="0" distR="0" wp14:anchorId="561B808C" wp14:editId="6B519454">
-            <wp:extent cx="5400040" cy="2225675"/>
-            <wp:effectExtent l="0" t="0" r="0" b="3175"/>
-            <wp:docPr id="1534854756" name="Picture 1" descr="A graph of a line and a line&#10;&#10;AI-generated content may be incorrect."/>
-            <wp:cNvGraphicFramePr>
-              <a:graphicFrameLocks xmlns:a="http://schemas.openxmlformats.org/drawingml/2006/main" noChangeAspect="1"/>
-            </wp:cNvGraphicFramePr>
-            <a:graphic xmlns:a="http://schemas.openxmlformats.org/drawingml/2006/main">
-              <a:graphicData uri="http://schemas.openxmlformats.org/drawingml/2006/picture">
-                <pic:pic xmlns:pic="http://schemas.openxmlformats.org/drawingml/2006/picture">
-                  <pic:nvPicPr>
-                    <pic:cNvPr id="1534854756" name="Picture 1" descr="A graph of a line and a line&#10;&#10;AI-generated content may be incorrect."/>
-                    <pic:cNvPicPr/>
-                  </pic:nvPicPr>
-                  <pic:blipFill>
-                    <a:blip r:embed="rId11"/>
-                    <a:stretch>
-                      <a:fillRect/>
-                    </a:stretch>
-                  </pic:blipFill>
-                  <pic:spPr>
-                    <a:xfrm>
-                      <a:off x="0" y="0"/>
-                      <a:ext cx="5400040" cy="2225675"/>
-                    </a:xfrm>
-                    <a:prstGeom prst="rect">
-                      <a:avLst/>
-                    </a:prstGeom>
-                  </pic:spPr>
-                </pic:pic>
-              </a:graphicData>
-            </a:graphic>
-          </wp:inline>
-        </w:drawing>
-      </w:r>
-    </w:p>
-    <w:p>
-      <w:r>
-        <w:t>Test set results:</w:t>
-      </w:r>
-      <w:r>
-        <w:br/>
-      </w:r>
-      <w:r>
-        <w:rPr>
-          <w:noProof/>
-        </w:rPr>
-        <w:drawing>
-          <wp:inline distT="0" distB="0" distL="0" distR="0" wp14:anchorId="58163E68" wp14:editId="01DFB513">
+          <wp:anchor distT="0" distB="0" distL="114300" distR="114300" simplePos="0" relativeHeight="251661312" behindDoc="0" locked="0" layoutInCell="1" allowOverlap="1" wp14:anchorId="47F1534E" wp14:editId="3EB68464">
+            <wp:simplePos x="0" y="0"/>
+            <wp:positionH relativeFrom="column">
+              <wp:posOffset>4481137</wp:posOffset>
+            </wp:positionH>
+            <wp:positionV relativeFrom="paragraph">
+              <wp:posOffset>1684886</wp:posOffset>
+            </wp:positionV>
             <wp:extent cx="5400040" cy="1207770"/>
             <wp:effectExtent l="0" t="0" r="0" b="0"/>
+            <wp:wrapNone/>
             <wp:docPr id="724879874" name="Picture 1" descr="A screenshot of a computer&#10;&#10;AI-generated content may be incorrect."/>
             <wp:cNvGraphicFramePr>
               <a:graphicFrameLocks xmlns:a="http://schemas.openxmlformats.org/drawingml/2006/main" noChangeAspect="1"/>
@@ -735,7 +322,7 @@
                     </pic:cNvPicPr>
                   </pic:nvPicPr>
                   <pic:blipFill>
-                    <a:blip r:embed="rId17">
+                    <a:blip r:embed="rId8">
                       <a:extLst>
                         <a:ext uri="{28A0092B-C50C-407E-A947-70E740481C1C}">
                           <a14:useLocalDpi xmlns:a14="http://schemas.microsoft.com/office/drawing/2010/main" val="0"/>
@@ -763,27 +350,725 @@
                 </pic:pic>
               </a:graphicData>
             </a:graphic>
+          </wp:anchor>
+        </w:drawing>
+      </w:r>
+      <w:r>
+        <w:rPr>
+          <w:noProof/>
+        </w:rPr>
+        <w:drawing>
+          <wp:inline distT="0" distB="0" distL="0" distR="0" wp14:anchorId="2A287167" wp14:editId="49BC7E7F">
+            <wp:extent cx="4010891" cy="2981284"/>
+            <wp:effectExtent l="0" t="0" r="8890" b="0"/>
+            <wp:docPr id="2140586476" name="Picture 1" descr="A screenshot of a computer&#10;&#10;AI-generated content may be incorrect."/>
+            <wp:cNvGraphicFramePr>
+              <a:graphicFrameLocks xmlns:a="http://schemas.openxmlformats.org/drawingml/2006/main" noChangeAspect="1"/>
+            </wp:cNvGraphicFramePr>
+            <a:graphic xmlns:a="http://schemas.openxmlformats.org/drawingml/2006/main">
+              <a:graphicData uri="http://schemas.openxmlformats.org/drawingml/2006/picture">
+                <pic:pic xmlns:pic="http://schemas.openxmlformats.org/drawingml/2006/picture">
+                  <pic:nvPicPr>
+                    <pic:cNvPr id="2140586476" name="Picture 1" descr="A screenshot of a computer&#10;&#10;AI-generated content may be incorrect."/>
+                    <pic:cNvPicPr/>
+                  </pic:nvPicPr>
+                  <pic:blipFill>
+                    <a:blip r:embed="rId9"/>
+                    <a:stretch>
+                      <a:fillRect/>
+                    </a:stretch>
+                  </pic:blipFill>
+                  <pic:spPr>
+                    <a:xfrm>
+                      <a:off x="0" y="0"/>
+                      <a:ext cx="4041325" cy="3003906"/>
+                    </a:xfrm>
+                    <a:prstGeom prst="rect">
+                      <a:avLst/>
+                    </a:prstGeom>
+                  </pic:spPr>
+                </pic:pic>
+              </a:graphicData>
+            </a:graphic>
           </wp:inline>
         </w:drawing>
       </w:r>
     </w:p>
+    <w:p>
+      <w:r>
+        <w:drawing>
+          <wp:anchor distT="0" distB="0" distL="114300" distR="114300" simplePos="0" relativeHeight="251663360" behindDoc="0" locked="0" layoutInCell="1" allowOverlap="1" wp14:anchorId="76DBDAC1" wp14:editId="510F8E55">
+            <wp:simplePos x="0" y="0"/>
+            <wp:positionH relativeFrom="margin">
+              <wp:posOffset>4412557</wp:posOffset>
+            </wp:positionH>
+            <wp:positionV relativeFrom="paragraph">
+              <wp:posOffset>8255</wp:posOffset>
+            </wp:positionV>
+            <wp:extent cx="4066310" cy="1675855"/>
+            <wp:effectExtent l="0" t="0" r="0" b="635"/>
+            <wp:wrapNone/>
+            <wp:docPr id="748514856" name="Picture 1" descr="A graph of a line and a line&#10;&#10;AI-generated content may be incorrect."/>
+            <wp:cNvGraphicFramePr>
+              <a:graphicFrameLocks xmlns:a="http://schemas.openxmlformats.org/drawingml/2006/main" noChangeAspect="1"/>
+            </wp:cNvGraphicFramePr>
+            <a:graphic xmlns:a="http://schemas.openxmlformats.org/drawingml/2006/main">
+              <a:graphicData uri="http://schemas.openxmlformats.org/drawingml/2006/picture">
+                <pic:pic xmlns:pic="http://schemas.openxmlformats.org/drawingml/2006/picture">
+                  <pic:nvPicPr>
+                    <pic:cNvPr id="748514856" name="Picture 1" descr="A graph of a line and a line&#10;&#10;AI-generated content may be incorrect."/>
+                    <pic:cNvPicPr/>
+                  </pic:nvPicPr>
+                  <pic:blipFill>
+                    <a:blip r:embed="rId10" cstate="print">
+                      <a:extLst>
+                        <a:ext uri="{28A0092B-C50C-407E-A947-70E740481C1C}">
+                          <a14:useLocalDpi xmlns:a14="http://schemas.microsoft.com/office/drawing/2010/main" val="0"/>
+                        </a:ext>
+                      </a:extLst>
+                    </a:blip>
+                    <a:stretch>
+                      <a:fillRect/>
+                    </a:stretch>
+                  </pic:blipFill>
+                  <pic:spPr>
+                    <a:xfrm>
+                      <a:off x="0" y="0"/>
+                      <a:ext cx="4066310" cy="1675855"/>
+                    </a:xfrm>
+                    <a:prstGeom prst="rect">
+                      <a:avLst/>
+                    </a:prstGeom>
+                  </pic:spPr>
+                </pic:pic>
+              </a:graphicData>
+            </a:graphic>
+            <wp14:sizeRelH relativeFrom="margin">
+              <wp14:pctWidth>0</wp14:pctWidth>
+            </wp14:sizeRelH>
+            <wp14:sizeRelV relativeFrom="margin">
+              <wp14:pctHeight>0</wp14:pctHeight>
+            </wp14:sizeRelV>
+          </wp:anchor>
+        </w:drawing>
+      </w:r>
+      <w:r>
+        <w:drawing>
+          <wp:anchor distT="0" distB="0" distL="114300" distR="114300" simplePos="0" relativeHeight="251662336" behindDoc="0" locked="0" layoutInCell="1" allowOverlap="1" wp14:anchorId="0686C0E5" wp14:editId="46AC0A2F">
+            <wp:simplePos x="0" y="0"/>
+            <wp:positionH relativeFrom="column">
+              <wp:posOffset>-76142</wp:posOffset>
+            </wp:positionH>
+            <wp:positionV relativeFrom="paragraph">
+              <wp:posOffset>249036</wp:posOffset>
+            </wp:positionV>
+            <wp:extent cx="4003964" cy="2969493"/>
+            <wp:effectExtent l="0" t="0" r="0" b="2540"/>
+            <wp:wrapNone/>
+            <wp:docPr id="419952653" name="Picture 1" descr="A screen shot of a computer&#10;&#10;AI-generated content may be incorrect."/>
+            <wp:cNvGraphicFramePr>
+              <a:graphicFrameLocks xmlns:a="http://schemas.openxmlformats.org/drawingml/2006/main" noChangeAspect="1"/>
+            </wp:cNvGraphicFramePr>
+            <a:graphic xmlns:a="http://schemas.openxmlformats.org/drawingml/2006/main">
+              <a:graphicData uri="http://schemas.openxmlformats.org/drawingml/2006/picture">
+                <pic:pic xmlns:pic="http://schemas.openxmlformats.org/drawingml/2006/picture">
+                  <pic:nvPicPr>
+                    <pic:cNvPr id="419952653" name="Picture 1" descr="A screen shot of a computer&#10;&#10;AI-generated content may be incorrect."/>
+                    <pic:cNvPicPr/>
+                  </pic:nvPicPr>
+                  <pic:blipFill>
+                    <a:blip r:embed="rId11" cstate="print">
+                      <a:extLst>
+                        <a:ext uri="{28A0092B-C50C-407E-A947-70E740481C1C}">
+                          <a14:useLocalDpi xmlns:a14="http://schemas.microsoft.com/office/drawing/2010/main" val="0"/>
+                        </a:ext>
+                      </a:extLst>
+                    </a:blip>
+                    <a:stretch>
+                      <a:fillRect/>
+                    </a:stretch>
+                  </pic:blipFill>
+                  <pic:spPr>
+                    <a:xfrm>
+                      <a:off x="0" y="0"/>
+                      <a:ext cx="4003964" cy="2969493"/>
+                    </a:xfrm>
+                    <a:prstGeom prst="rect">
+                      <a:avLst/>
+                    </a:prstGeom>
+                  </pic:spPr>
+                </pic:pic>
+              </a:graphicData>
+            </a:graphic>
+            <wp14:sizeRelH relativeFrom="margin">
+              <wp14:pctWidth>0</wp14:pctWidth>
+            </wp14:sizeRelH>
+            <wp14:sizeRelV relativeFrom="margin">
+              <wp14:pctHeight>0</wp14:pctHeight>
+            </wp14:sizeRelV>
+          </wp:anchor>
+        </w:drawing>
+      </w:r>
+      <w:r>
+        <w:t>Whole dataset (v2):</w:t>
+      </w:r>
+    </w:p>
     <w:p/>
     <w:p>
       <w:r>
-        <w:lastRenderedPageBreak/>
-        <w:t>Full dataset:</w:t>
+        <w:br/>
       </w:r>
     </w:p>
     <w:p/>
     <w:p/>
     <w:p>
       <w:r>
+        <w:drawing>
+          <wp:anchor distT="0" distB="0" distL="114300" distR="114300" simplePos="0" relativeHeight="251664384" behindDoc="0" locked="0" layoutInCell="1" allowOverlap="1" wp14:anchorId="7758B237" wp14:editId="4BFB1EC1">
+            <wp:simplePos x="0" y="0"/>
+            <wp:positionH relativeFrom="column">
+              <wp:posOffset>4377805</wp:posOffset>
+            </wp:positionH>
+            <wp:positionV relativeFrom="paragraph">
+              <wp:posOffset>22571</wp:posOffset>
+            </wp:positionV>
+            <wp:extent cx="5230091" cy="1251843"/>
+            <wp:effectExtent l="0" t="0" r="0" b="5715"/>
+            <wp:wrapNone/>
+            <wp:docPr id="494503190" name="Picture 1" descr="A black screen with white text&#10;&#10;AI-generated content may be incorrect."/>
+            <wp:cNvGraphicFramePr>
+              <a:graphicFrameLocks xmlns:a="http://schemas.openxmlformats.org/drawingml/2006/main" noChangeAspect="1"/>
+            </wp:cNvGraphicFramePr>
+            <a:graphic xmlns:a="http://schemas.openxmlformats.org/drawingml/2006/main">
+              <a:graphicData uri="http://schemas.openxmlformats.org/drawingml/2006/picture">
+                <pic:pic xmlns:pic="http://schemas.openxmlformats.org/drawingml/2006/picture">
+                  <pic:nvPicPr>
+                    <pic:cNvPr id="494503190" name="Picture 1" descr="A black screen with white text&#10;&#10;AI-generated content may be incorrect."/>
+                    <pic:cNvPicPr/>
+                  </pic:nvPicPr>
+                  <pic:blipFill>
+                    <a:blip r:embed="rId12">
+                      <a:extLst>
+                        <a:ext uri="{28A0092B-C50C-407E-A947-70E740481C1C}">
+                          <a14:useLocalDpi xmlns:a14="http://schemas.microsoft.com/office/drawing/2010/main" val="0"/>
+                        </a:ext>
+                      </a:extLst>
+                    </a:blip>
+                    <a:stretch>
+                      <a:fillRect/>
+                    </a:stretch>
+                  </pic:blipFill>
+                  <pic:spPr>
+                    <a:xfrm>
+                      <a:off x="0" y="0"/>
+                      <a:ext cx="5230091" cy="1251843"/>
+                    </a:xfrm>
+                    <a:prstGeom prst="rect">
+                      <a:avLst/>
+                    </a:prstGeom>
+                  </pic:spPr>
+                </pic:pic>
+              </a:graphicData>
+            </a:graphic>
+            <wp14:sizeRelH relativeFrom="margin">
+              <wp14:pctWidth>0</wp14:pctWidth>
+            </wp14:sizeRelH>
+            <wp14:sizeRelV relativeFrom="margin">
+              <wp14:pctHeight>0</wp14:pctHeight>
+            </wp14:sizeRelV>
+          </wp:anchor>
+        </w:drawing>
+      </w:r>
+    </w:p>
+    <w:p/>
+    <w:p>
+      <w:pPr>
+        <w:rPr>
+          <w:b/>
+          <w:bCs/>
+        </w:rPr>
+      </w:pPr>
+    </w:p>
+    <w:p>
+      <w:r>
+        <w:lastRenderedPageBreak/>
+        <w:t>STFT</w:t>
+      </w:r>
+    </w:p>
+    <w:p/>
+    <w:p>
+      <w:r>
+        <w:t>STFT with Delta and Delta-Delta</w:t>
+      </w:r>
+    </w:p>
+    <w:p/>
+    <w:p>
+      <w:proofErr w:type="spellStart"/>
+      <w:r>
+        <w:t>LogMEL</w:t>
+      </w:r>
+      <w:proofErr w:type="spellEnd"/>
+    </w:p>
+    <w:p/>
+    <w:p>
+      <w:proofErr w:type="spellStart"/>
+      <w:r>
+        <w:t>LogMEL</w:t>
+      </w:r>
+      <w:proofErr w:type="spellEnd"/>
+      <w:r>
+        <w:t xml:space="preserve"> with Delta and Delta-Delta</w:t>
+      </w:r>
+    </w:p>
+    <w:p>
+      <w:r>
+        <w:t>Epochs</w:t>
+      </w:r>
+    </w:p>
+    <w:p>
+      <w:r>
+        <w:t>MFCC</w:t>
+      </w:r>
+    </w:p>
+    <w:p>
+      <w:r>
+        <w:t>10k samples</w:t>
+      </w:r>
+    </w:p>
+    <w:p>
+      <w:r>
+        <w:rPr>
+          <w:noProof/>
+        </w:rPr>
+        <w:drawing>
+          <wp:inline distT="0" distB="0" distL="0" distR="0" wp14:anchorId="22B66140" wp14:editId="0645DE6A">
+            <wp:extent cx="3882572" cy="2854403"/>
+            <wp:effectExtent l="0" t="0" r="3810" b="3175"/>
+            <wp:docPr id="1469750615" name="Picture 1" descr="A screenshot of a computer&#10;&#10;AI-generated content may be incorrect."/>
+            <wp:cNvGraphicFramePr>
+              <a:graphicFrameLocks xmlns:a="http://schemas.openxmlformats.org/drawingml/2006/main" noChangeAspect="1"/>
+            </wp:cNvGraphicFramePr>
+            <a:graphic xmlns:a="http://schemas.openxmlformats.org/drawingml/2006/main">
+              <a:graphicData uri="http://schemas.openxmlformats.org/drawingml/2006/picture">
+                <pic:pic xmlns:pic="http://schemas.openxmlformats.org/drawingml/2006/picture">
+                  <pic:nvPicPr>
+                    <pic:cNvPr id="1469750615" name="Picture 1" descr="A screenshot of a computer&#10;&#10;AI-generated content may be incorrect."/>
+                    <pic:cNvPicPr/>
+                  </pic:nvPicPr>
+                  <pic:blipFill>
+                    <a:blip r:embed="rId13"/>
+                    <a:stretch>
+                      <a:fillRect/>
+                    </a:stretch>
+                  </pic:blipFill>
+                  <pic:spPr>
+                    <a:xfrm>
+                      <a:off x="0" y="0"/>
+                      <a:ext cx="3896387" cy="2864559"/>
+                    </a:xfrm>
+                    <a:prstGeom prst="rect">
+                      <a:avLst/>
+                    </a:prstGeom>
+                  </pic:spPr>
+                </pic:pic>
+              </a:graphicData>
+            </a:graphic>
+          </wp:inline>
+        </w:drawing>
+      </w:r>
+    </w:p>
+    <w:p>
+      <w:r>
+        <w:rPr>
+          <w:noProof/>
+        </w:rPr>
+        <w:lastRenderedPageBreak/>
+        <w:drawing>
+          <wp:inline distT="0" distB="0" distL="0" distR="0" wp14:anchorId="5784C66C" wp14:editId="42A14D78">
+            <wp:extent cx="5400040" cy="2225675"/>
+            <wp:effectExtent l="0" t="0" r="0" b="3175"/>
+            <wp:docPr id="841847213" name="Picture 1" descr="A graph of a graph of two people&#10;&#10;AI-generated content may be incorrect."/>
+            <wp:cNvGraphicFramePr>
+              <a:graphicFrameLocks xmlns:a="http://schemas.openxmlformats.org/drawingml/2006/main" noChangeAspect="1"/>
+            </wp:cNvGraphicFramePr>
+            <a:graphic xmlns:a="http://schemas.openxmlformats.org/drawingml/2006/main">
+              <a:graphicData uri="http://schemas.openxmlformats.org/drawingml/2006/picture">
+                <pic:pic xmlns:pic="http://schemas.openxmlformats.org/drawingml/2006/picture">
+                  <pic:nvPicPr>
+                    <pic:cNvPr id="841847213" name="Picture 1" descr="A graph of a graph of two people&#10;&#10;AI-generated content may be incorrect."/>
+                    <pic:cNvPicPr/>
+                  </pic:nvPicPr>
+                  <pic:blipFill>
+                    <a:blip r:embed="rId14"/>
+                    <a:stretch>
+                      <a:fillRect/>
+                    </a:stretch>
+                  </pic:blipFill>
+                  <pic:spPr>
+                    <a:xfrm>
+                      <a:off x="0" y="0"/>
+                      <a:ext cx="5400040" cy="2225675"/>
+                    </a:xfrm>
+                    <a:prstGeom prst="rect">
+                      <a:avLst/>
+                    </a:prstGeom>
+                  </pic:spPr>
+                </pic:pic>
+              </a:graphicData>
+            </a:graphic>
+          </wp:inline>
+        </w:drawing>
+      </w:r>
+    </w:p>
+    <w:p>
+      <w:r>
+        <w:rPr>
+          <w:noProof/>
+        </w:rPr>
+        <w:drawing>
+          <wp:inline distT="0" distB="0" distL="0" distR="0" wp14:anchorId="1EDEA371" wp14:editId="7D01AEF3">
+            <wp:extent cx="5400040" cy="956310"/>
+            <wp:effectExtent l="0" t="0" r="0" b="0"/>
+            <wp:docPr id="1341847390" name="Picture 1" descr="A screen shot of a computer&#10;&#10;AI-generated content may be incorrect."/>
+            <wp:cNvGraphicFramePr>
+              <a:graphicFrameLocks xmlns:a="http://schemas.openxmlformats.org/drawingml/2006/main" noChangeAspect="1"/>
+            </wp:cNvGraphicFramePr>
+            <a:graphic xmlns:a="http://schemas.openxmlformats.org/drawingml/2006/main">
+              <a:graphicData uri="http://schemas.openxmlformats.org/drawingml/2006/picture">
+                <pic:pic xmlns:pic="http://schemas.openxmlformats.org/drawingml/2006/picture">
+                  <pic:nvPicPr>
+                    <pic:cNvPr id="1341847390" name="Picture 1" descr="A screen shot of a computer&#10;&#10;AI-generated content may be incorrect."/>
+                    <pic:cNvPicPr/>
+                  </pic:nvPicPr>
+                  <pic:blipFill>
+                    <a:blip r:embed="rId15"/>
+                    <a:stretch>
+                      <a:fillRect/>
+                    </a:stretch>
+                  </pic:blipFill>
+                  <pic:spPr>
+                    <a:xfrm>
+                      <a:off x="0" y="0"/>
+                      <a:ext cx="5400040" cy="956310"/>
+                    </a:xfrm>
+                    <a:prstGeom prst="rect">
+                      <a:avLst/>
+                    </a:prstGeom>
+                  </pic:spPr>
+                </pic:pic>
+              </a:graphicData>
+            </a:graphic>
+          </wp:inline>
+        </w:drawing>
+      </w:r>
+      <w:r>
+        <w:t>–</w:t>
+      </w:r>
+    </w:p>
+    <w:p>
+      <w:r>
+        <w:t>MFCC with Delta and Delta-Delta</w:t>
+      </w:r>
+    </w:p>
+    <w:p/>
+    <w:p>
+      <w:pPr>
+        <w:rPr>
+          <w:b/>
+          <w:bCs/>
+        </w:rPr>
+      </w:pPr>
+      <w:r>
+        <w:rPr>
+          <w:b/>
+          <w:bCs/>
+        </w:rPr>
+        <w:t>LFCC</w:t>
+      </w:r>
+    </w:p>
+    <w:p>
+      <w:r>
+        <w:t>10k samples:</w:t>
+      </w:r>
+    </w:p>
+    <w:p>
+      <w:r>
+        <w:rPr>
+          <w:noProof/>
+        </w:rPr>
+        <w:lastRenderedPageBreak/>
+        <w:drawing>
+          <wp:inline distT="0" distB="0" distL="0" distR="0" wp14:anchorId="41BE634A" wp14:editId="5D9BB022">
+            <wp:extent cx="4329642" cy="3171371"/>
+            <wp:effectExtent l="0" t="0" r="0" b="0"/>
+            <wp:docPr id="1622165654" name="Picture 1" descr="A screen shot of a computer&#10;&#10;AI-generated content may be incorrect."/>
+            <wp:cNvGraphicFramePr>
+              <a:graphicFrameLocks xmlns:a="http://schemas.openxmlformats.org/drawingml/2006/main" noChangeAspect="1"/>
+            </wp:cNvGraphicFramePr>
+            <a:graphic xmlns:a="http://schemas.openxmlformats.org/drawingml/2006/main">
+              <a:graphicData uri="http://schemas.openxmlformats.org/drawingml/2006/picture">
+                <pic:pic xmlns:pic="http://schemas.openxmlformats.org/drawingml/2006/picture">
+                  <pic:nvPicPr>
+                    <pic:cNvPr id="1622165654" name="Picture 1" descr="A screen shot of a computer&#10;&#10;AI-generated content may be incorrect."/>
+                    <pic:cNvPicPr/>
+                  </pic:nvPicPr>
+                  <pic:blipFill>
+                    <a:blip r:embed="rId16"/>
+                    <a:stretch>
+                      <a:fillRect/>
+                    </a:stretch>
+                  </pic:blipFill>
+                  <pic:spPr>
+                    <a:xfrm>
+                      <a:off x="0" y="0"/>
+                      <a:ext cx="4340825" cy="3179562"/>
+                    </a:xfrm>
+                    <a:prstGeom prst="rect">
+                      <a:avLst/>
+                    </a:prstGeom>
+                  </pic:spPr>
+                </pic:pic>
+              </a:graphicData>
+            </a:graphic>
+          </wp:inline>
+        </w:drawing>
+      </w:r>
+    </w:p>
+    <w:p>
+      <w:r>
+        <w:rPr>
+          <w:noProof/>
+        </w:rPr>
+        <w:drawing>
+          <wp:inline distT="0" distB="0" distL="0" distR="0" wp14:anchorId="37BE3FD1" wp14:editId="76D29C63">
+            <wp:extent cx="5400040" cy="2225675"/>
+            <wp:effectExtent l="0" t="0" r="0" b="3175"/>
+            <wp:docPr id="2034097849" name="Picture 1" descr="A graph of a graph of a graph of a graph of a graph of a graph of a graph of a graph of a graph of a graph of a graph of a graph of a graph of&#10;&#10;AI-generated content may be incorrect."/>
+            <wp:cNvGraphicFramePr>
+              <a:graphicFrameLocks xmlns:a="http://schemas.openxmlformats.org/drawingml/2006/main" noChangeAspect="1"/>
+            </wp:cNvGraphicFramePr>
+            <a:graphic xmlns:a="http://schemas.openxmlformats.org/drawingml/2006/main">
+              <a:graphicData uri="http://schemas.openxmlformats.org/drawingml/2006/picture">
+                <pic:pic xmlns:pic="http://schemas.openxmlformats.org/drawingml/2006/picture">
+                  <pic:nvPicPr>
+                    <pic:cNvPr id="2034097849" name="Picture 1" descr="A graph of a graph of a graph of a graph of a graph of a graph of a graph of a graph of a graph of a graph of a graph of a graph of a graph of&#10;&#10;AI-generated content may be incorrect."/>
+                    <pic:cNvPicPr/>
+                  </pic:nvPicPr>
+                  <pic:blipFill>
+                    <a:blip r:embed="rId17"/>
+                    <a:stretch>
+                      <a:fillRect/>
+                    </a:stretch>
+                  </pic:blipFill>
+                  <pic:spPr>
+                    <a:xfrm>
+                      <a:off x="0" y="0"/>
+                      <a:ext cx="5400040" cy="2225675"/>
+                    </a:xfrm>
+                    <a:prstGeom prst="rect">
+                      <a:avLst/>
+                    </a:prstGeom>
+                  </pic:spPr>
+                </pic:pic>
+              </a:graphicData>
+            </a:graphic>
+          </wp:inline>
+        </w:drawing>
+      </w:r>
+    </w:p>
+    <w:p>
+      <w:r>
+        <w:rPr>
+          <w:noProof/>
+        </w:rPr>
+        <w:lastRenderedPageBreak/>
+        <w:drawing>
+          <wp:inline distT="0" distB="0" distL="0" distR="0" wp14:anchorId="02D6786A" wp14:editId="247D5A4E">
+            <wp:extent cx="5400040" cy="989330"/>
+            <wp:effectExtent l="0" t="0" r="0" b="1270"/>
+            <wp:docPr id="1840558227" name="Picture 1" descr="A black screen with white text&#10;&#10;AI-generated content may be incorrect."/>
+            <wp:cNvGraphicFramePr>
+              <a:graphicFrameLocks xmlns:a="http://schemas.openxmlformats.org/drawingml/2006/main" noChangeAspect="1"/>
+            </wp:cNvGraphicFramePr>
+            <a:graphic xmlns:a="http://schemas.openxmlformats.org/drawingml/2006/main">
+              <a:graphicData uri="http://schemas.openxmlformats.org/drawingml/2006/picture">
+                <pic:pic xmlns:pic="http://schemas.openxmlformats.org/drawingml/2006/picture">
+                  <pic:nvPicPr>
+                    <pic:cNvPr id="1840558227" name="Picture 1" descr="A black screen with white text&#10;&#10;AI-generated content may be incorrect."/>
+                    <pic:cNvPicPr/>
+                  </pic:nvPicPr>
+                  <pic:blipFill>
+                    <a:blip r:embed="rId18"/>
+                    <a:stretch>
+                      <a:fillRect/>
+                    </a:stretch>
+                  </pic:blipFill>
+                  <pic:spPr>
+                    <a:xfrm>
+                      <a:off x="0" y="0"/>
+                      <a:ext cx="5400040" cy="989330"/>
+                    </a:xfrm>
+                    <a:prstGeom prst="rect">
+                      <a:avLst/>
+                    </a:prstGeom>
+                  </pic:spPr>
+                </pic:pic>
+              </a:graphicData>
+            </a:graphic>
+          </wp:inline>
+        </w:drawing>
+      </w:r>
+    </w:p>
+    <w:p/>
+    <w:p>
+      <w:r>
+        <w:t>Whole dataset (Learning rate: 1e-4 / Batch size: 32 / Patience: 10)</w:t>
+      </w:r>
+    </w:p>
+    <w:p>
+      <w:r>
+        <w:rPr>
+          <w:noProof/>
+        </w:rPr>
+        <w:drawing>
+          <wp:inline distT="0" distB="0" distL="0" distR="0" wp14:anchorId="443BE169" wp14:editId="29297E61">
+            <wp:extent cx="5400040" cy="4071620"/>
+            <wp:effectExtent l="0" t="0" r="0" b="5080"/>
+            <wp:docPr id="1328198992" name="Picture 1" descr="A screenshot of a computer&#10;&#10;AI-generated content may be incorrect."/>
+            <wp:cNvGraphicFramePr>
+              <a:graphicFrameLocks xmlns:a="http://schemas.openxmlformats.org/drawingml/2006/main" noChangeAspect="1"/>
+            </wp:cNvGraphicFramePr>
+            <a:graphic xmlns:a="http://schemas.openxmlformats.org/drawingml/2006/main">
+              <a:graphicData uri="http://schemas.openxmlformats.org/drawingml/2006/picture">
+                <pic:pic xmlns:pic="http://schemas.openxmlformats.org/drawingml/2006/picture">
+                  <pic:nvPicPr>
+                    <pic:cNvPr id="1328198992" name="Picture 1" descr="A screenshot of a computer&#10;&#10;AI-generated content may be incorrect."/>
+                    <pic:cNvPicPr/>
+                  </pic:nvPicPr>
+                  <pic:blipFill>
+                    <a:blip r:embed="rId19"/>
+                    <a:stretch>
+                      <a:fillRect/>
+                    </a:stretch>
+                  </pic:blipFill>
+                  <pic:spPr>
+                    <a:xfrm>
+                      <a:off x="0" y="0"/>
+                      <a:ext cx="5400040" cy="4071620"/>
+                    </a:xfrm>
+                    <a:prstGeom prst="rect">
+                      <a:avLst/>
+                    </a:prstGeom>
+                  </pic:spPr>
+                </pic:pic>
+              </a:graphicData>
+            </a:graphic>
+          </wp:inline>
+        </w:drawing>
+      </w:r>
+    </w:p>
+    <w:p>
+      <w:r>
+        <w:rPr>
+          <w:noProof/>
+        </w:rPr>
+        <w:lastRenderedPageBreak/>
+        <w:drawing>
+          <wp:inline distT="0" distB="0" distL="0" distR="0" wp14:anchorId="1FB981B6" wp14:editId="3AC547CD">
+            <wp:extent cx="5400040" cy="2225675"/>
+            <wp:effectExtent l="0" t="0" r="0" b="3175"/>
+            <wp:docPr id="2124287550" name="Picture 1" descr="A graph of a line and a line&#10;&#10;AI-generated content may be incorrect."/>
+            <wp:cNvGraphicFramePr>
+              <a:graphicFrameLocks xmlns:a="http://schemas.openxmlformats.org/drawingml/2006/main" noChangeAspect="1"/>
+            </wp:cNvGraphicFramePr>
+            <a:graphic xmlns:a="http://schemas.openxmlformats.org/drawingml/2006/main">
+              <a:graphicData uri="http://schemas.openxmlformats.org/drawingml/2006/picture">
+                <pic:pic xmlns:pic="http://schemas.openxmlformats.org/drawingml/2006/picture">
+                  <pic:nvPicPr>
+                    <pic:cNvPr id="2124287550" name="Picture 1" descr="A graph of a line and a line&#10;&#10;AI-generated content may be incorrect."/>
+                    <pic:cNvPicPr/>
+                  </pic:nvPicPr>
+                  <pic:blipFill>
+                    <a:blip r:embed="rId7"/>
+                    <a:stretch>
+                      <a:fillRect/>
+                    </a:stretch>
+                  </pic:blipFill>
+                  <pic:spPr>
+                    <a:xfrm>
+                      <a:off x="0" y="0"/>
+                      <a:ext cx="5400040" cy="2225675"/>
+                    </a:xfrm>
+                    <a:prstGeom prst="rect">
+                      <a:avLst/>
+                    </a:prstGeom>
+                  </pic:spPr>
+                </pic:pic>
+              </a:graphicData>
+            </a:graphic>
+          </wp:inline>
+        </w:drawing>
+      </w:r>
+    </w:p>
+    <w:p>
+      <w:r>
+        <w:rPr>
+          <w:noProof/>
+        </w:rPr>
+        <w:drawing>
+          <wp:inline distT="0" distB="0" distL="0" distR="0" wp14:anchorId="26E522A9" wp14:editId="044789DE">
+            <wp:extent cx="5400040" cy="1198880"/>
+            <wp:effectExtent l="0" t="0" r="0" b="1270"/>
+            <wp:docPr id="1314972586" name="Picture 1" descr="A screenshot of a computer&#10;&#10;AI-generated content may be incorrect."/>
+            <wp:cNvGraphicFramePr>
+              <a:graphicFrameLocks xmlns:a="http://schemas.openxmlformats.org/drawingml/2006/main" noChangeAspect="1"/>
+            </wp:cNvGraphicFramePr>
+            <a:graphic xmlns:a="http://schemas.openxmlformats.org/drawingml/2006/main">
+              <a:graphicData uri="http://schemas.openxmlformats.org/drawingml/2006/picture">
+                <pic:pic xmlns:pic="http://schemas.openxmlformats.org/drawingml/2006/picture">
+                  <pic:nvPicPr>
+                    <pic:cNvPr id="1314972586" name="Picture 1" descr="A screenshot of a computer&#10;&#10;AI-generated content may be incorrect."/>
+                    <pic:cNvPicPr/>
+                  </pic:nvPicPr>
+                  <pic:blipFill>
+                    <a:blip r:embed="rId20"/>
+                    <a:stretch>
+                      <a:fillRect/>
+                    </a:stretch>
+                  </pic:blipFill>
+                  <pic:spPr>
+                    <a:xfrm>
+                      <a:off x="0" y="0"/>
+                      <a:ext cx="5400040" cy="1198880"/>
+                    </a:xfrm>
+                    <a:prstGeom prst="rect">
+                      <a:avLst/>
+                    </a:prstGeom>
+                  </pic:spPr>
+                </pic:pic>
+              </a:graphicData>
+            </a:graphic>
+          </wp:inline>
+        </w:drawing>
+      </w:r>
+    </w:p>
+    <w:p/>
+    <w:p/>
+    <w:p>
+      <w:r>
+        <w:t>Full dataset:</w:t>
+      </w:r>
+    </w:p>
+    <w:p/>
+    <w:p/>
+    <w:p>
+      <w:r>
         <w:t>Wav2Vec</w:t>
       </w:r>
     </w:p>
     <w:sectPr>
-      <w:pgSz w:w="11906" w:h="16838"/>
-      <w:pgMar w:top="1417" w:right="1701" w:bottom="1417" w:left="1701" w:header="708" w:footer="708" w:gutter="0"/>
+      <w:pgSz w:w="16838" w:h="11906" w:orient="landscape"/>
+      <w:pgMar w:top="720" w:right="720" w:bottom="720" w:left="720" w:header="708" w:footer="708" w:gutter="0"/>
       <w:cols w:space="708"/>
       <w:docGrid w:linePitch="360"/>
     </w:sectPr>

</xml_diff>

<commit_message>
- Updated Wav2Vec extraction (to match the requirements of the Frontend UI) - Updated the Frontend UI code (working but not as expected)
</commit_message>
<xml_diff>
--- a/results_report.docx
+++ b/results_report.docx
@@ -107,7 +107,7 @@
           <w:noProof/>
         </w:rPr>
         <w:drawing>
-          <wp:anchor distT="0" distB="0" distL="114300" distR="114300" simplePos="0" relativeHeight="251658240" behindDoc="0" locked="0" layoutInCell="1" allowOverlap="1" wp14:anchorId="713EB8AE" wp14:editId="71D71B8D">
+          <wp:anchor distT="0" distB="0" distL="114300" distR="114300" simplePos="0" relativeHeight="251658240" behindDoc="0" locked="0" layoutInCell="1" allowOverlap="1" wp14:anchorId="713EB8AE" wp14:editId="2EFB97BC">
             <wp:simplePos x="0" y="0"/>
             <wp:positionH relativeFrom="margin">
               <wp:posOffset>4163291</wp:posOffset>
@@ -396,6 +396,9 @@
     </w:p>
     <w:p>
       <w:r>
+        <w:rPr>
+          <w:noProof/>
+        </w:rPr>
         <w:drawing>
           <wp:anchor distT="0" distB="0" distL="114300" distR="114300" simplePos="0" relativeHeight="251663360" behindDoc="0" locked="0" layoutInCell="1" allowOverlap="1" wp14:anchorId="76DBDAC1" wp14:editId="510F8E55">
             <wp:simplePos x="0" y="0"/>
@@ -453,6 +456,9 @@
         </w:drawing>
       </w:r>
       <w:r>
+        <w:rPr>
+          <w:noProof/>
+        </w:rPr>
         <w:drawing>
           <wp:anchor distT="0" distB="0" distL="114300" distR="114300" simplePos="0" relativeHeight="251662336" behindDoc="0" locked="0" layoutInCell="1" allowOverlap="1" wp14:anchorId="0686C0E5" wp14:editId="46AC0A2F">
             <wp:simplePos x="0" y="0"/>
@@ -523,6 +529,9 @@
     <w:p/>
     <w:p>
       <w:r>
+        <w:rPr>
+          <w:noProof/>
+        </w:rPr>
         <w:drawing>
           <wp:anchor distT="0" distB="0" distL="114300" distR="114300" simplePos="0" relativeHeight="251664384" behindDoc="0" locked="0" layoutInCell="1" allowOverlap="1" wp14:anchorId="7758B237" wp14:editId="4BFB1EC1">
             <wp:simplePos x="0" y="0"/>
@@ -1054,18 +1063,164 @@
     </w:p>
     <w:p/>
     <w:p/>
-    <w:p>
-      <w:r>
-        <w:t>Full dataset:</w:t>
-      </w:r>
-    </w:p>
-    <w:p/>
-    <w:p/>
-    <w:p>
-      <w:r>
+    <w:p/>
+    <w:p>
+      <w:r>
+        <w:br w:type="page"/>
+      </w:r>
+    </w:p>
+    <w:p>
+      <w:r>
+        <w:lastRenderedPageBreak/>
         <w:t>Wav2Vec</w:t>
       </w:r>
     </w:p>
+    <w:p>
+      <w:r>
+        <w:t>V1: 128 hidden dimensions / 2x Convolution Layers (1d) (K=</w:t>
+      </w:r>
+      <w:proofErr w:type="gramStart"/>
+      <w:r>
+        <w:t>3,S</w:t>
+      </w:r>
+      <w:proofErr w:type="gramEnd"/>
+      <w:r>
+        <w:t xml:space="preserve">=1)- 1x </w:t>
+      </w:r>
+      <w:proofErr w:type="spellStart"/>
+      <w:r>
+        <w:t>MaxPooling</w:t>
+      </w:r>
+      <w:proofErr w:type="spellEnd"/>
+      <w:r>
+        <w:t xml:space="preserve"> Layer (K=2, S=2, P=0) / 2x Fully Connected Layers / RELU / Batch: 64</w:t>
+      </w:r>
+    </w:p>
+    <w:p>
+      <w:r>
+        <w:drawing>
+          <wp:anchor distT="0" distB="0" distL="114300" distR="114300" simplePos="0" relativeHeight="251666432" behindDoc="0" locked="0" layoutInCell="1" allowOverlap="1" wp14:anchorId="224A3AAA" wp14:editId="252DFF26">
+            <wp:simplePos x="0" y="0"/>
+            <wp:positionH relativeFrom="column">
+              <wp:posOffset>3886835</wp:posOffset>
+            </wp:positionH>
+            <wp:positionV relativeFrom="paragraph">
+              <wp:posOffset>15067</wp:posOffset>
+            </wp:positionV>
+            <wp:extent cx="6255327" cy="2578017"/>
+            <wp:effectExtent l="0" t="0" r="0" b="0"/>
+            <wp:wrapNone/>
+            <wp:docPr id="166542281" name="Picture 1" descr="A graph of two people&#10;&#10;AI-generated content may be incorrect."/>
+            <wp:cNvGraphicFramePr>
+              <a:graphicFrameLocks xmlns:a="http://schemas.openxmlformats.org/drawingml/2006/main" noChangeAspect="1"/>
+            </wp:cNvGraphicFramePr>
+            <a:graphic xmlns:a="http://schemas.openxmlformats.org/drawingml/2006/main">
+              <a:graphicData uri="http://schemas.openxmlformats.org/drawingml/2006/picture">
+                <pic:pic xmlns:pic="http://schemas.openxmlformats.org/drawingml/2006/picture">
+                  <pic:nvPicPr>
+                    <pic:cNvPr id="166542281" name="Picture 1" descr="A graph of two people&#10;&#10;AI-generated content may be incorrect."/>
+                    <pic:cNvPicPr/>
+                  </pic:nvPicPr>
+                  <pic:blipFill>
+                    <a:blip r:embed="rId21">
+                      <a:extLst>
+                        <a:ext uri="{28A0092B-C50C-407E-A947-70E740481C1C}">
+                          <a14:useLocalDpi xmlns:a14="http://schemas.microsoft.com/office/drawing/2010/main" val="0"/>
+                        </a:ext>
+                      </a:extLst>
+                    </a:blip>
+                    <a:stretch>
+                      <a:fillRect/>
+                    </a:stretch>
+                  </pic:blipFill>
+                  <pic:spPr>
+                    <a:xfrm>
+                      <a:off x="0" y="0"/>
+                      <a:ext cx="6255327" cy="2578017"/>
+                    </a:xfrm>
+                    <a:prstGeom prst="rect">
+                      <a:avLst/>
+                    </a:prstGeom>
+                  </pic:spPr>
+                </pic:pic>
+              </a:graphicData>
+            </a:graphic>
+          </wp:anchor>
+        </w:drawing>
+      </w:r>
+      <w:r>
+        <w:drawing>
+          <wp:anchor distT="0" distB="0" distL="114300" distR="114300" simplePos="0" relativeHeight="251665408" behindDoc="0" locked="0" layoutInCell="1" allowOverlap="1" wp14:anchorId="2B3DB12F" wp14:editId="43690542">
+            <wp:simplePos x="0" y="0"/>
+            <wp:positionH relativeFrom="margin">
+              <wp:posOffset>117128</wp:posOffset>
+            </wp:positionH>
+            <wp:positionV relativeFrom="paragraph">
+              <wp:posOffset>12180</wp:posOffset>
+            </wp:positionV>
+            <wp:extent cx="3643630" cy="2739390"/>
+            <wp:effectExtent l="0" t="0" r="0" b="3810"/>
+            <wp:wrapNone/>
+            <wp:docPr id="1154512553" name="Picture 1" descr="A screenshot of a computer&#10;&#10;AI-generated content may be incorrect."/>
+            <wp:cNvGraphicFramePr>
+              <a:graphicFrameLocks xmlns:a="http://schemas.openxmlformats.org/drawingml/2006/main" noChangeAspect="1"/>
+            </wp:cNvGraphicFramePr>
+            <a:graphic xmlns:a="http://schemas.openxmlformats.org/drawingml/2006/main">
+              <a:graphicData uri="http://schemas.openxmlformats.org/drawingml/2006/picture">
+                <pic:pic xmlns:pic="http://schemas.openxmlformats.org/drawingml/2006/picture">
+                  <pic:nvPicPr>
+                    <pic:cNvPr id="1154512553" name="Picture 1" descr="A screenshot of a computer&#10;&#10;AI-generated content may be incorrect."/>
+                    <pic:cNvPicPr/>
+                  </pic:nvPicPr>
+                  <pic:blipFill>
+                    <a:blip r:embed="rId22" cstate="print">
+                      <a:extLst>
+                        <a:ext uri="{28A0092B-C50C-407E-A947-70E740481C1C}">
+                          <a14:useLocalDpi xmlns:a14="http://schemas.microsoft.com/office/drawing/2010/main" val="0"/>
+                        </a:ext>
+                      </a:extLst>
+                    </a:blip>
+                    <a:stretch>
+                      <a:fillRect/>
+                    </a:stretch>
+                  </pic:blipFill>
+                  <pic:spPr>
+                    <a:xfrm>
+                      <a:off x="0" y="0"/>
+                      <a:ext cx="3643630" cy="2739390"/>
+                    </a:xfrm>
+                    <a:prstGeom prst="rect">
+                      <a:avLst/>
+                    </a:prstGeom>
+                  </pic:spPr>
+                </pic:pic>
+              </a:graphicData>
+            </a:graphic>
+            <wp14:sizeRelH relativeFrom="margin">
+              <wp14:pctWidth>0</wp14:pctWidth>
+            </wp14:sizeRelH>
+            <wp14:sizeRelV relativeFrom="margin">
+              <wp14:pctHeight>0</wp14:pctHeight>
+            </wp14:sizeRelV>
+          </wp:anchor>
+        </w:drawing>
+      </w:r>
+    </w:p>
+    <w:p/>
+    <w:p/>
+    <w:p/>
+    <w:p/>
+    <w:p/>
+    <w:p/>
+    <w:p/>
+    <w:p/>
+    <w:p/>
+    <w:p>
+      <w:r>
+        <w:t xml:space="preserve">V2: </w:t>
+      </w:r>
+    </w:p>
+    <w:p/>
     <w:sectPr>
       <w:pgSz w:w="16838" w:h="11906" w:orient="landscape"/>
       <w:pgMar w:top="720" w:right="720" w:bottom="720" w:left="720" w:header="708" w:footer="708" w:gutter="0"/>

</xml_diff>